<commit_message>
docs: regenera notebook, documento y README con los hallazgos corregidos
</commit_message>
<xml_diff>
--- a/report/VEMIO_metodologia_hallazgos.docx
+++ b/report/VEMIO_metodologia_hallazgos.docx
@@ -4,22 +4,22 @@
   <w:body>
     <w:p>
       <w:pPr>
-        <w:spacing w:after="40"/>
+        <w:spacing w:after="30"/>
       </w:pPr>
       <w:r>
         <w:rPr>
           <w:rFonts w:ascii="Calibri" w:cs="Calibri" w:eastAsia="Calibri" w:hAnsi="Calibri"/>
           <w:b/>
           <w:bCs/>
-          <w:sz w:val="32"/>
-          <w:szCs w:val="32"/>
+          <w:sz w:val="30"/>
+          <w:szCs w:val="30"/>
         </w:rPr>
         <w:t xml:space="preserve">VEMIO — Prueba Técnica AI Product Engineer</w:t>
       </w:r>
     </w:p>
     <w:p>
       <w:pPr>
-        <w:spacing w:after="200"/>
+        <w:spacing w:after="180"/>
       </w:pPr>
       <w:r>
         <w:rPr>
@@ -27,8 +27,8 @@
           <w:i/>
           <w:iCs/>
           <w:color w:val="555555"/>
-          <w:sz w:val="22"/>
-          <w:szCs w:val="22"/>
+          <w:sz w:val="21"/>
+          <w:szCs w:val="21"/>
         </w:rPr>
         <w:t xml:space="preserve">Metodología, supuestos, trade-offs y recomendaciones de negocio</w:t>
       </w:r>
@@ -36,80 +36,733 @@
     <w:p>
       <w:pPr>
         <w:pStyle w:val="Heading2"/>
-        <w:spacing w:after="80" w:before="200"/>
-      </w:pPr>
-      <w:r>
-        <w:t xml:space="preserve">1. Supuestos y tratamiento de datos</w:t>
-      </w:r>
-    </w:p>
-    <w:p>
-      <w:pPr>
-        <w:spacing w:after="120"/>
-      </w:pPr>
-      <w:r>
-        <w:rPr>
-          <w:rFonts w:ascii="Calibri" w:cs="Calibri" w:eastAsia="Calibri" w:hAnsi="Calibri"/>
-          <w:sz w:val="20"/>
-          <w:szCs w:val="20"/>
-        </w:rPr>
-        <w:t xml:space="preserve">El dataset (283,533 transacciones, ene-2025 a ene-2027) tiene inconsistencias intencionales que se trataron sin eliminar filas: los 500 tickets cancelados (cantidad = 0) se excluyeron de todo análisis de demanda; las 500 ventas de muestra/regalo (monto = 0, cantidad &gt; 0) se mantuvieron en unidades pero se excluyeron de los análisis de precio, donde un precio de $0 no aporta señal. El descuento nulo (5.5% de filas) se imputó como 0 en ventas orgánicas y como la mediana del combo cuando la venta pertenecía a una promoción. Los 110 nulos de costo y precio bruto, y la fila con metadata de producto incompleta, se recuperaron usando la relación fija y verificada por SKU precio_lista = costo × (1 + margen).</w:t>
+        <w:spacing w:after="70" w:before="190"/>
+      </w:pPr>
+      <w:r>
+        <w:t xml:space="preserve">1. El hallazgo que ordena todo el análisis</w:t>
+      </w:r>
+    </w:p>
+    <w:p>
+      <w:pPr>
+        <w:spacing w:after="110"/>
+      </w:pPr>
+      <w:r>
+        <w:rPr>
+          <w:rFonts w:ascii="Calibri" w:cs="Calibri" w:eastAsia="Calibri" w:hAnsi="Calibri"/>
+          <w:sz w:val="19"/>
+          <w:szCs w:val="19"/>
+        </w:rPr>
+        <w:t xml:space="preserve">product_margin (0.20–0.30) es un markup sobre costo, no un margen sobre ingreso. La distinción define cuánto descuento soporta cada SKU antes de vender a pérdida: si precio_lista = costo × (1+m), el margen sobre ingreso es m/(1+m), y ese mismo número es el descuento de equilibrio.</w:t>
+      </w:r>
+    </w:p>
+    <w:p>
+      <w:pPr>
+        <w:spacing w:after="110"/>
+      </w:pPr>
+      <w:r>
+        <w:rPr>
+          <w:rFonts w:ascii="Calibri" w:cs="Calibri" w:eastAsia="Calibri" w:hAnsi="Calibri"/>
+          <w:sz w:val="19"/>
+          <w:szCs w:val="19"/>
+        </w:rPr>
+        <w:t xml:space="preserve">Con márgenes de 18%–23% sobre ingreso, dos combos de Desodorante 150 ml A (descuentos de 20.1% y 21.1%, equilibrio en 18.0%) vendieron por debajo del costo. Ninguna cantidad de volumen adicional puede rescatar una venta bajo costo: es una pérdida que escala con el éxito de la promoción.</w:t>
       </w:r>
     </w:p>
     <w:p>
       <w:pPr>
         <w:pStyle w:val="Heading2"/>
-        <w:spacing w:after="80" w:before="200"/>
-      </w:pPr>
-      <w:r>
-        <w:t xml:space="preserve">2. Metodología por reto</w:t>
-      </w:r>
-    </w:p>
-    <w:p>
-      <w:pPr>
-        <w:spacing w:after="120"/>
-      </w:pPr>
-      <w:r>
-        <w:rPr>
-          <w:rFonts w:ascii="Calibri" w:cs="Calibri" w:eastAsia="Calibri" w:hAnsi="Calibri"/>
-          <w:sz w:val="20"/>
-          <w:szCs w:val="20"/>
-        </w:rPr>
-        <w:t xml:space="preserve">Reto A — Forecasting: se proyectó la demanda semanal de los 3 SKUs de mayor volumen (Shampoo Rizos, Desodorante 150ml A, Cubito de pollo) a 10 semanas, comparando un baseline seasonal-naive (semana equivalente del año anterior) contra un modelo LightGBM con features de calendario, lags y medias móviles, con pronóstico recursivo. La validación fue walk-forward con 5 orígenes temporales distintos (sin usar información posterior al origen en cada backtest), usando WAPE como métrica por ser robusta a semanas de bajo volumen y directamente interpretable como % de error sobre el volumen total. El modelo ganador se eligió por SKU: LightGBM para Shampoo Rizos (WAPE 13.9% vs 16.2%), seasonal-naive para Desodorante y Cubito, donde el patrón promocional año-contra-año domina.</w:t>
-      </w:r>
-    </w:p>
-    <w:p>
-      <w:pPr>
-        <w:spacing w:after="120"/>
-      </w:pPr>
-      <w:r>
-        <w:rPr>
-          <w:rFonts w:ascii="Calibri" w:cs="Calibri" w:eastAsia="Calibri" w:hAnsi="Calibri"/>
-          <w:sz w:val="20"/>
-          <w:szCs w:val="20"/>
-        </w:rPr>
-        <w:t xml:space="preserve">Reto B — Elasticidad: para Antitranspirante 150ml C (mayor variación de precio observada) se estimó una regresión log-log de cantidad semanal contra precio efectivo, controlando por tendencia y estacionalidad mensual, con errores robustos. La elasticidad resultó en -2.98 (demanda muy sensible al precio). El simulador precio→demanda/ingreso/margen usa esa elasticidad anclada a la demanda reciente, evaluado solo dentro del rango de precio históricamente observado.</w:t>
-      </w:r>
-    </w:p>
-    <w:p>
-      <w:pPr>
-        <w:spacing w:after="120"/>
-      </w:pPr>
-      <w:r>
-        <w:rPr>
-          <w:rFonts w:ascii="Calibri" w:cs="Calibri" w:eastAsia="Calibri" w:hAnsi="Calibri"/>
-          <w:sz w:val="20"/>
-          <w:szCs w:val="20"/>
-        </w:rPr>
-        <w:t xml:space="preserve">Reto C — Uplift: para cada una de las 19 promociones del histórico se ajustó un modelo estacional entrenado únicamente con semanas sin promoción de ese SKU, usado para estimar la demanda contrafactual durante la ventana promocional. El uplift es la diferencia entre venta real y esa contrafactual, convertida también a impacto en ingreso y margen usando costo unitario y precio de referencia no-promocional.</w:t>
+        <w:spacing w:after="70" w:before="190"/>
+      </w:pPr>
+      <w:r>
+        <w:t xml:space="preserve">2. Supuestos y tratamiento de datos</w:t>
+      </w:r>
+    </w:p>
+    <w:p>
+      <w:pPr>
+        <w:spacing w:after="110"/>
+      </w:pPr>
+      <w:r>
+        <w:rPr>
+          <w:rFonts w:ascii="Calibri" w:cs="Calibri" w:eastAsia="Calibri" w:hAnsi="Calibri"/>
+          <w:sz w:val="19"/>
+          <w:szCs w:val="19"/>
+        </w:rPr>
+        <w:t xml:space="preserve">No se eliminó ninguna fila: cada inconsistencia se marca con una bandera y se filtra sólo donde distorsiona. Los 500 tickets cancelados (cantidad = 0) se excluyen de los análisis de demanda. Las 500 ventas de muestra/regalo (monto = 0, cantidad &gt; 0) cuentan en unidades — movieron inventario real — pero se excluyen de los análisis de precio, donde un precio de $0 no es señal de pricing. El descuento nulo (5.5% de filas) se imputa como 0 en ventas orgánicas y como la mediana del combo cuando la venta es promocional, porque el descuento se define a nivel de combo y no siempre se prorratea línea por línea. Los 110 nulos de costo y bruto, y la fila con metadata de producto vacía, se reconstruyen con la relación fija por SKU precio_lista = costo × (1 + margen), verificada empíricamente.</w:t>
+      </w:r>
+    </w:p>
+    <w:p>
+      <w:pPr>
+        <w:spacing w:after="110"/>
+      </w:pPr>
+      <w:r>
+        <w:rPr>
+          <w:rFonts w:ascii="Calibri" w:cs="Calibri" w:eastAsia="Calibri" w:hAnsi="Calibri"/>
+          <w:i/>
+          <w:iCs/>
+          <w:sz w:val="19"/>
+          <w:szCs w:val="19"/>
+        </w:rPr>
+        <w:t xml:space="preserve">Un supuesto que resultó importante: el costo unitario NO es constante. Sube 5%–6% al año. Anclar la economía de cada promoción a su propia ventana (en vez de usar la mediana histórica del SKU) cambia los resultados de margen hasta en 44%.</w:t>
+      </w:r>
+    </w:p>
+    <w:p>
+      <w:pPr>
+        <w:spacing w:after="110"/>
+      </w:pPr>
+      <w:r>
+        <w:rPr>
+          <w:rFonts w:ascii="Calibri" w:cs="Calibri" w:eastAsia="Calibri" w:hAnsi="Calibri"/>
+          <w:sz w:val="19"/>
+          <w:szCs w:val="19"/>
+        </w:rPr>
+        <w:t xml:space="preserve">Nota sobre el brief: el documento del caso indica en un lugar “~41,300 clientes” y en otro “~52,500”, y el periodo aparece como “ene-2025 a ene-2027 (~24 meses)” y también como “2025-01 a 2026-05, 17 meses”. Los datos reales tienen 41,334 clientes y van de 2025-01-06 a 2027-01-03. Se trabajó con los datos; vale la pena confirmarlo con ustedes.</w:t>
       </w:r>
     </w:p>
     <w:p>
       <w:pPr>
         <w:pStyle w:val="Heading2"/>
-        <w:spacing w:after="80" w:before="200"/>
-      </w:pPr>
-      <w:r>
-        <w:t xml:space="preserve">3. Trade-offs y qué haría distinto con más tiempo o datos</w:t>
+        <w:spacing w:after="70" w:before="190"/>
+      </w:pPr>
+      <w:r>
+        <w:t xml:space="preserve">3. Metodología por reto</w:t>
+      </w:r>
+    </w:p>
+    <w:p>
+      <w:pPr>
+        <w:spacing w:after="110"/>
+      </w:pPr>
+      <w:r>
+        <w:rPr>
+          <w:rFonts w:ascii="Calibri" w:cs="Calibri" w:eastAsia="Calibri" w:hAnsi="Calibri"/>
+          <w:b/>
+          <w:bCs/>
+          <w:sz w:val="19"/>
+          <w:szCs w:val="19"/>
+        </w:rPr>
+        <w:t xml:space="preserve">Reto A — Forecasting. Demanda semanal a 10 semanas para los 3 SKUs de mayor volumen. Validación walk-forward con 5 orígenes temporales: en cada uno se entrena sólo con datos anteriores y se proyecta hacia adelante. Métrica WAPE, por ser robusta a semanas de bajo volumen y leerse como “% de error sobre el volumen total”. Se compararon tres modelos:</w:t>
+      </w:r>
+    </w:p>
+    <w:tbl>
+      <w:tblPr>
+        <w:tblW w:type="auto" w:w="100"/>
+        <w:tblBorders>
+          <w:top w:val="single" w:color="auto" w:sz="4"/>
+          <w:left w:val="single" w:color="auto" w:sz="4"/>
+          <w:bottom w:val="single" w:color="auto" w:sz="4"/>
+          <w:right w:val="single" w:color="auto" w:sz="4"/>
+          <w:insideH w:val="single" w:color="auto" w:sz="4"/>
+          <w:insideV w:val="single" w:color="auto" w:sz="4"/>
+        </w:tblBorders>
+      </w:tblPr>
+      <w:tblGrid>
+        <w:gridCol w:w="2900"/>
+        <w:gridCol w:w="1500"/>
+        <w:gridCol w:w="1500"/>
+        <w:gridCol w:w="1500"/>
+        <w:gridCol w:w="2400"/>
+      </w:tblGrid>
+      <w:tr>
+        <w:tc>
+          <w:tcPr>
+            <w:tcW w:type="dxa" w:w="2900"/>
+            <w:shd w:fill="E8EEF4" w:val="clear"/>
+            <w:tcMar>
+              <w:top w:type="dxa" w:w="50"/>
+              <w:left w:type="dxa" w:w="80"/>
+              <w:bottom w:type="dxa" w:w="50"/>
+              <w:right w:type="dxa" w:w="80"/>
+            </w:tcMar>
+          </w:tcPr>
+          <w:p>
+            <w:r>
+              <w:rPr>
+                <w:rFonts w:ascii="Calibri" w:cs="Calibri" w:eastAsia="Calibri" w:hAnsi="Calibri"/>
+                <w:b/>
+                <w:bCs/>
+                <w:sz w:val="17"/>
+                <w:szCs w:val="17"/>
+              </w:rPr>
+              <w:t xml:space="preserve">Modelo</w:t>
+            </w:r>
+          </w:p>
+        </w:tc>
+        <w:tc>
+          <w:tcPr>
+            <w:tcW w:type="dxa" w:w="1500"/>
+            <w:shd w:fill="E8EEF4" w:val="clear"/>
+            <w:tcMar>
+              <w:top w:type="dxa" w:w="50"/>
+              <w:left w:type="dxa" w:w="80"/>
+              <w:bottom w:type="dxa" w:w="50"/>
+              <w:right w:type="dxa" w:w="80"/>
+            </w:tcMar>
+          </w:tcPr>
+          <w:p>
+            <w:r>
+              <w:rPr>
+                <w:rFonts w:ascii="Calibri" w:cs="Calibri" w:eastAsia="Calibri" w:hAnsi="Calibri"/>
+                <w:b/>
+                <w:bCs/>
+                <w:sz w:val="17"/>
+                <w:szCs w:val="17"/>
+              </w:rPr>
+              <w:t xml:space="preserve">Shampoo Rizos</w:t>
+            </w:r>
+          </w:p>
+        </w:tc>
+        <w:tc>
+          <w:tcPr>
+            <w:tcW w:type="dxa" w:w="1500"/>
+            <w:shd w:fill="E8EEF4" w:val="clear"/>
+            <w:tcMar>
+              <w:top w:type="dxa" w:w="50"/>
+              <w:left w:type="dxa" w:w="80"/>
+              <w:bottom w:type="dxa" w:w="50"/>
+              <w:right w:type="dxa" w:w="80"/>
+            </w:tcMar>
+          </w:tcPr>
+          <w:p>
+            <w:r>
+              <w:rPr>
+                <w:rFonts w:ascii="Calibri" w:cs="Calibri" w:eastAsia="Calibri" w:hAnsi="Calibri"/>
+                <w:b/>
+                <w:bCs/>
+                <w:sz w:val="17"/>
+                <w:szCs w:val="17"/>
+              </w:rPr>
+              <w:t xml:space="preserve">Desodorante</w:t>
+            </w:r>
+          </w:p>
+        </w:tc>
+        <w:tc>
+          <w:tcPr>
+            <w:tcW w:type="dxa" w:w="1500"/>
+            <w:shd w:fill="E8EEF4" w:val="clear"/>
+            <w:tcMar>
+              <w:top w:type="dxa" w:w="50"/>
+              <w:left w:type="dxa" w:w="80"/>
+              <w:bottom w:type="dxa" w:w="50"/>
+              <w:right w:type="dxa" w:w="80"/>
+            </w:tcMar>
+          </w:tcPr>
+          <w:p>
+            <w:r>
+              <w:rPr>
+                <w:rFonts w:ascii="Calibri" w:cs="Calibri" w:eastAsia="Calibri" w:hAnsi="Calibri"/>
+                <w:b/>
+                <w:bCs/>
+                <w:sz w:val="17"/>
+                <w:szCs w:val="17"/>
+              </w:rPr>
+              <w:t xml:space="preserve">Cubito</w:t>
+            </w:r>
+          </w:p>
+        </w:tc>
+        <w:tc>
+          <w:tcPr>
+            <w:tcW w:type="dxa" w:w="2400"/>
+            <w:shd w:fill="E8EEF4" w:val="clear"/>
+            <w:tcMar>
+              <w:top w:type="dxa" w:w="50"/>
+              <w:left w:type="dxa" w:w="80"/>
+              <w:bottom w:type="dxa" w:w="50"/>
+              <w:right w:type="dxa" w:w="80"/>
+            </w:tcMar>
+          </w:tcPr>
+          <w:p>
+            <w:r>
+              <w:rPr>
+                <w:rFonts w:ascii="Calibri" w:cs="Calibri" w:eastAsia="Calibri" w:hAnsi="Calibri"/>
+                <w:b/>
+                <w:bCs/>
+                <w:sz w:val="17"/>
+                <w:szCs w:val="17"/>
+              </w:rPr>
+              <w:t xml:space="preserve">Comentario</w:t>
+            </w:r>
+          </w:p>
+        </w:tc>
+      </w:tr>
+      <w:tr>
+        <w:tc>
+          <w:tcPr>
+            <w:tcW w:type="dxa" w:w="2900"/>
+            <w:tcMar>
+              <w:top w:type="dxa" w:w="50"/>
+              <w:left w:type="dxa" w:w="80"/>
+              <w:bottom w:type="dxa" w:w="50"/>
+              <w:right w:type="dxa" w:w="80"/>
+            </w:tcMar>
+          </w:tcPr>
+          <w:p>
+            <w:r>
+              <w:rPr>
+                <w:rFonts w:ascii="Calibri" w:cs="Calibri" w:eastAsia="Calibri" w:hAnsi="Calibri"/>
+                <w:b w:val="false"/>
+                <w:bCs w:val="false"/>
+                <w:sz w:val="17"/>
+                <w:szCs w:val="17"/>
+              </w:rPr>
+              <w:t xml:space="preserve">seasonal-naive (baseline)</w:t>
+            </w:r>
+          </w:p>
+        </w:tc>
+        <w:tc>
+          <w:tcPr>
+            <w:tcW w:type="dxa" w:w="1500"/>
+            <w:tcMar>
+              <w:top w:type="dxa" w:w="50"/>
+              <w:left w:type="dxa" w:w="80"/>
+              <w:bottom w:type="dxa" w:w="50"/>
+              <w:right w:type="dxa" w:w="80"/>
+            </w:tcMar>
+          </w:tcPr>
+          <w:p>
+            <w:r>
+              <w:rPr>
+                <w:rFonts w:ascii="Calibri" w:cs="Calibri" w:eastAsia="Calibri" w:hAnsi="Calibri"/>
+                <w:b w:val="false"/>
+                <w:bCs w:val="false"/>
+                <w:sz w:val="17"/>
+                <w:szCs w:val="17"/>
+              </w:rPr>
+              <w:t xml:space="preserve">16.2%</w:t>
+            </w:r>
+          </w:p>
+        </w:tc>
+        <w:tc>
+          <w:tcPr>
+            <w:tcW w:type="dxa" w:w="1500"/>
+            <w:tcMar>
+              <w:top w:type="dxa" w:w="50"/>
+              <w:left w:type="dxa" w:w="80"/>
+              <w:bottom w:type="dxa" w:w="50"/>
+              <w:right w:type="dxa" w:w="80"/>
+            </w:tcMar>
+          </w:tcPr>
+          <w:p>
+            <w:r>
+              <w:rPr>
+                <w:rFonts w:ascii="Calibri" w:cs="Calibri" w:eastAsia="Calibri" w:hAnsi="Calibri"/>
+                <w:b w:val="false"/>
+                <w:bCs w:val="false"/>
+                <w:sz w:val="17"/>
+                <w:szCs w:val="17"/>
+              </w:rPr>
+              <w:t xml:space="preserve">38.2%</w:t>
+            </w:r>
+          </w:p>
+        </w:tc>
+        <w:tc>
+          <w:tcPr>
+            <w:tcW w:type="dxa" w:w="1500"/>
+            <w:tcMar>
+              <w:top w:type="dxa" w:w="50"/>
+              <w:left w:type="dxa" w:w="80"/>
+              <w:bottom w:type="dxa" w:w="50"/>
+              <w:right w:type="dxa" w:w="80"/>
+            </w:tcMar>
+          </w:tcPr>
+          <w:p>
+            <w:r>
+              <w:rPr>
+                <w:rFonts w:ascii="Calibri" w:cs="Calibri" w:eastAsia="Calibri" w:hAnsi="Calibri"/>
+                <w:b w:val="false"/>
+                <w:bCs w:val="false"/>
+                <w:sz w:val="17"/>
+                <w:szCs w:val="17"/>
+              </w:rPr>
+              <w:t xml:space="preserve">10.0%</w:t>
+            </w:r>
+          </w:p>
+        </w:tc>
+        <w:tc>
+          <w:tcPr>
+            <w:tcW w:type="dxa" w:w="2400"/>
+            <w:tcMar>
+              <w:top w:type="dxa" w:w="50"/>
+              <w:left w:type="dxa" w:w="80"/>
+              <w:bottom w:type="dxa" w:w="50"/>
+              <w:right w:type="dxa" w:w="80"/>
+            </w:tcMar>
+          </w:tcPr>
+          <w:p>
+            <w:r>
+              <w:rPr>
+                <w:rFonts w:ascii="Calibri" w:cs="Calibri" w:eastAsia="Calibri" w:hAnsi="Calibri"/>
+                <w:b w:val="false"/>
+                <w:bCs w:val="false"/>
+                <w:sz w:val="17"/>
+                <w:szCs w:val="17"/>
+              </w:rPr>
+              <w:t xml:space="preserve">Repite la semana equivalente del año anterior</w:t>
+            </w:r>
+          </w:p>
+        </w:tc>
+      </w:tr>
+      <w:tr>
+        <w:tc>
+          <w:tcPr>
+            <w:tcW w:type="dxa" w:w="2900"/>
+            <w:tcMar>
+              <w:top w:type="dxa" w:w="50"/>
+              <w:left w:type="dxa" w:w="80"/>
+              <w:bottom w:type="dxa" w:w="50"/>
+              <w:right w:type="dxa" w:w="80"/>
+            </w:tcMar>
+          </w:tcPr>
+          <w:p>
+            <w:r>
+              <w:rPr>
+                <w:rFonts w:ascii="Calibri" w:cs="Calibri" w:eastAsia="Calibri" w:hAnsi="Calibri"/>
+                <w:b w:val="false"/>
+                <w:bCs w:val="false"/>
+                <w:sz w:val="17"/>
+                <w:szCs w:val="17"/>
+              </w:rPr>
+              <w:t xml:space="preserve">LightGBM</w:t>
+            </w:r>
+          </w:p>
+        </w:tc>
+        <w:tc>
+          <w:tcPr>
+            <w:tcW w:type="dxa" w:w="1500"/>
+            <w:tcMar>
+              <w:top w:type="dxa" w:w="50"/>
+              <w:left w:type="dxa" w:w="80"/>
+              <w:bottom w:type="dxa" w:w="50"/>
+              <w:right w:type="dxa" w:w="80"/>
+            </w:tcMar>
+          </w:tcPr>
+          <w:p>
+            <w:r>
+              <w:rPr>
+                <w:rFonts w:ascii="Calibri" w:cs="Calibri" w:eastAsia="Calibri" w:hAnsi="Calibri"/>
+                <w:b w:val="false"/>
+                <w:bCs w:val="false"/>
+                <w:sz w:val="17"/>
+                <w:szCs w:val="17"/>
+              </w:rPr>
+              <w:t xml:space="preserve">13.9%</w:t>
+            </w:r>
+          </w:p>
+        </w:tc>
+        <w:tc>
+          <w:tcPr>
+            <w:tcW w:type="dxa" w:w="1500"/>
+            <w:tcMar>
+              <w:top w:type="dxa" w:w="50"/>
+              <w:left w:type="dxa" w:w="80"/>
+              <w:bottom w:type="dxa" w:w="50"/>
+              <w:right w:type="dxa" w:w="80"/>
+            </w:tcMar>
+          </w:tcPr>
+          <w:p>
+            <w:r>
+              <w:rPr>
+                <w:rFonts w:ascii="Calibri" w:cs="Calibri" w:eastAsia="Calibri" w:hAnsi="Calibri"/>
+                <w:b w:val="false"/>
+                <w:bCs w:val="false"/>
+                <w:sz w:val="17"/>
+                <w:szCs w:val="17"/>
+              </w:rPr>
+              <w:t xml:space="preserve">59.4%</w:t>
+            </w:r>
+          </w:p>
+        </w:tc>
+        <w:tc>
+          <w:tcPr>
+            <w:tcW w:type="dxa" w:w="1500"/>
+            <w:tcMar>
+              <w:top w:type="dxa" w:w="50"/>
+              <w:left w:type="dxa" w:w="80"/>
+              <w:bottom w:type="dxa" w:w="50"/>
+              <w:right w:type="dxa" w:w="80"/>
+            </w:tcMar>
+          </w:tcPr>
+          <w:p>
+            <w:r>
+              <w:rPr>
+                <w:rFonts w:ascii="Calibri" w:cs="Calibri" w:eastAsia="Calibri" w:hAnsi="Calibri"/>
+                <w:b w:val="false"/>
+                <w:bCs w:val="false"/>
+                <w:sz w:val="17"/>
+                <w:szCs w:val="17"/>
+              </w:rPr>
+              <w:t xml:space="preserve">10.4%</w:t>
+            </w:r>
+          </w:p>
+        </w:tc>
+        <w:tc>
+          <w:tcPr>
+            <w:tcW w:type="dxa" w:w="2400"/>
+            <w:tcMar>
+              <w:top w:type="dxa" w:w="50"/>
+              <w:left w:type="dxa" w:w="80"/>
+              <w:bottom w:type="dxa" w:w="50"/>
+              <w:right w:type="dxa" w:w="80"/>
+            </w:tcMar>
+          </w:tcPr>
+          <w:p>
+            <w:r>
+              <w:rPr>
+                <w:rFonts w:ascii="Calibri" w:cs="Calibri" w:eastAsia="Calibri" w:hAnsi="Calibri"/>
+                <w:b w:val="false"/>
+                <w:bCs w:val="false"/>
+                <w:sz w:val="17"/>
+                <w:szCs w:val="17"/>
+              </w:rPr>
+              <w:t xml:space="preserve">Calendario + lags + medias móviles</w:t>
+            </w:r>
+          </w:p>
+        </w:tc>
+      </w:tr>
+      <w:tr>
+        <w:tc>
+          <w:tcPr>
+            <w:tcW w:type="dxa" w:w="2900"/>
+            <w:tcMar>
+              <w:top w:type="dxa" w:w="50"/>
+              <w:left w:type="dxa" w:w="80"/>
+              <w:bottom w:type="dxa" w:w="50"/>
+              <w:right w:type="dxa" w:w="80"/>
+            </w:tcMar>
+          </w:tcPr>
+          <w:p>
+            <w:r>
+              <w:rPr>
+                <w:rFonts w:ascii="Calibri" w:cs="Calibri" w:eastAsia="Calibri" w:hAnsi="Calibri"/>
+                <w:b w:val="false"/>
+                <w:bCs w:val="false"/>
+                <w:sz w:val="17"/>
+                <w:szCs w:val="17"/>
+              </w:rPr>
+              <w:t xml:space="preserve">LightGBM + calendario promo</w:t>
+            </w:r>
+          </w:p>
+        </w:tc>
+        <w:tc>
+          <w:tcPr>
+            <w:tcW w:type="dxa" w:w="1500"/>
+            <w:tcMar>
+              <w:top w:type="dxa" w:w="50"/>
+              <w:left w:type="dxa" w:w="80"/>
+              <w:bottom w:type="dxa" w:w="50"/>
+              <w:right w:type="dxa" w:w="80"/>
+            </w:tcMar>
+          </w:tcPr>
+          <w:p>
+            <w:r>
+              <w:rPr>
+                <w:rFonts w:ascii="Calibri" w:cs="Calibri" w:eastAsia="Calibri" w:hAnsi="Calibri"/>
+                <w:b w:val="false"/>
+                <w:bCs w:val="false"/>
+                <w:sz w:val="17"/>
+                <w:szCs w:val="17"/>
+              </w:rPr>
+              <w:t xml:space="preserve">14.3%</w:t>
+            </w:r>
+          </w:p>
+        </w:tc>
+        <w:tc>
+          <w:tcPr>
+            <w:tcW w:type="dxa" w:w="1500"/>
+            <w:tcMar>
+              <w:top w:type="dxa" w:w="50"/>
+              <w:left w:type="dxa" w:w="80"/>
+              <w:bottom w:type="dxa" w:w="50"/>
+              <w:right w:type="dxa" w:w="80"/>
+            </w:tcMar>
+          </w:tcPr>
+          <w:p>
+            <w:r>
+              <w:rPr>
+                <w:rFonts w:ascii="Calibri" w:cs="Calibri" w:eastAsia="Calibri" w:hAnsi="Calibri"/>
+                <w:b w:val="false"/>
+                <w:bCs w:val="false"/>
+                <w:sz w:val="17"/>
+                <w:szCs w:val="17"/>
+              </w:rPr>
+              <w:t xml:space="preserve">9.2%</w:t>
+            </w:r>
+          </w:p>
+        </w:tc>
+        <w:tc>
+          <w:tcPr>
+            <w:tcW w:type="dxa" w:w="1500"/>
+            <w:tcMar>
+              <w:top w:type="dxa" w:w="50"/>
+              <w:left w:type="dxa" w:w="80"/>
+              <w:bottom w:type="dxa" w:w="50"/>
+              <w:right w:type="dxa" w:w="80"/>
+            </w:tcMar>
+          </w:tcPr>
+          <w:p>
+            <w:r>
+              <w:rPr>
+                <w:rFonts w:ascii="Calibri" w:cs="Calibri" w:eastAsia="Calibri" w:hAnsi="Calibri"/>
+                <w:b w:val="false"/>
+                <w:bCs w:val="false"/>
+                <w:sz w:val="17"/>
+                <w:szCs w:val="17"/>
+              </w:rPr>
+              <w:t xml:space="preserve">10.2%</w:t>
+            </w:r>
+          </w:p>
+        </w:tc>
+        <w:tc>
+          <w:tcPr>
+            <w:tcW w:type="dxa" w:w="2400"/>
+            <w:tcMar>
+              <w:top w:type="dxa" w:w="50"/>
+              <w:left w:type="dxa" w:w="80"/>
+              <w:bottom w:type="dxa" w:w="50"/>
+              <w:right w:type="dxa" w:w="80"/>
+            </w:tcMar>
+          </w:tcPr>
+          <w:p>
+            <w:r>
+              <w:rPr>
+                <w:rFonts w:ascii="Calibri" w:cs="Calibri" w:eastAsia="Calibri" w:hAnsi="Calibri"/>
+                <w:b w:val="false"/>
+                <w:bCs w:val="false"/>
+                <w:sz w:val="17"/>
+                <w:szCs w:val="17"/>
+              </w:rPr>
+              <w:t xml:space="preserve">Modelo elegido para los 3 SKUs</w:t>
+            </w:r>
+          </w:p>
+        </w:tc>
+      </w:tr>
+    </w:tbl>
+    <w:p>
+      <w:pPr>
+        <w:spacing w:after="110"/>
+      </w:pPr>
+      <w:r>
+        <w:rPr>
+          <w:rFonts w:ascii="Calibri" w:cs="Calibri" w:eastAsia="Calibri" w:hAnsi="Calibri"/>
+          <w:sz w:val="19"/>
+          <w:szCs w:val="19"/>
+        </w:rPr>
+        <w:t xml:space="preserve"/>
+      </w:r>
+    </w:p>
+    <w:p>
+      <w:pPr>
+        <w:spacing w:after="110"/>
+      </w:pPr>
+      <w:r>
+        <w:rPr>
+          <w:rFonts w:ascii="Calibri" w:cs="Calibri" w:eastAsia="Calibri" w:hAnsi="Calibri"/>
+          <w:sz w:val="19"/>
+          <w:szCs w:val="19"/>
+        </w:rPr>
+        <w:t xml:space="preserve">El resultado decisivo está en Desodorante: sin el calendario promocional ningún modelo sirve (38%–59% de error). Es el SKU más promocionado y sus combos duplican la demanda; un modelo que no sabe cuándo ocurren sólo puede promediar ruido. Incorporarlos baja el error a 9.2%, mejor en los 5 orígenes del backtest sin excepción. El calendario no es fuga de información: el equipo comercial lo decide con anticipación, así que en producción se conoce para todo el horizonte.</w:t>
+      </w:r>
+    </w:p>
+    <w:p>
+      <w:pPr>
+        <w:spacing w:after="110"/>
+      </w:pPr>
+      <w:r>
+        <w:rPr>
+          <w:rFonts w:ascii="Calibri" w:cs="Calibri" w:eastAsia="Calibri" w:hAnsi="Calibri"/>
+          <w:sz w:val="19"/>
+          <w:szCs w:val="19"/>
+        </w:rPr>
+        <w:t xml:space="preserve">Se optó por un único modelo para los tres SKUs (11.2% de WAPE promedio) en vez de elegir el mejor por SKU (20.7%): es más preciso, más simple de operar, y evita sobreajustar la elección sobre sólo 5 observaciones de backtest.</w:t>
+      </w:r>
+    </w:p>
+    <w:p>
+      <w:pPr>
+        <w:spacing w:after="110"/>
+      </w:pPr>
+      <w:r>
+        <w:rPr>
+          <w:rFonts w:ascii="Calibri" w:cs="Calibri" w:eastAsia="Calibri" w:hAnsi="Calibri"/>
+          <w:b/>
+          <w:bCs/>
+          <w:sz w:val="19"/>
+          <w:szCs w:val="19"/>
+        </w:rPr>
+        <w:t xml:space="preserve">Reto B — Sensibilidad al precio. Regresión log-log de cantidad semanal contra precio efectivo, controlando tendencia y estacionalidad, con errores robustos. La elasticidad estimada es −2.98, y se mueve a −2.58 al controlar por “hay combo activo”; se reporta el rango, no el punto, porque la precisión aparente del primer número no está respaldada.</w:t>
+      </w:r>
+    </w:p>
+    <w:p>
+      <w:pPr>
+        <w:spacing w:after="110"/>
+      </w:pPr>
+      <w:r>
+        <w:rPr>
+          <w:rFonts w:ascii="Calibri" w:cs="Calibri" w:eastAsia="Calibri" w:hAnsi="Calibri"/>
+          <w:sz w:val="19"/>
+          <w:szCs w:val="19"/>
+        </w:rPr>
+        <w:t xml:space="preserve">Advertencia de identificación: en este dataset el precio efectivo semanal casi no varía por pricing puro, varía porque hay o no un combo activo (correlación −0.93). El coeficiente captura el efecto combinado de activar un combo a profundidad d — precio, visibilidad y mecánica de bundle juntos — no una elasticidad de manual. Es honesto nombrarlo así, y sigue siendo útil: esa es la palanca que el equipo realmente controla.</w:t>
+      </w:r>
+    </w:p>
+    <w:p>
+      <w:pPr>
+        <w:spacing w:after="110"/>
+      </w:pPr>
+      <w:r>
+        <w:rPr>
+          <w:rFonts w:ascii="Calibri" w:cs="Calibri" w:eastAsia="Calibri" w:hAnsi="Calibri"/>
+          <w:sz w:val="19"/>
+          <w:szCs w:val="19"/>
+        </w:rPr>
+        <w:t xml:space="preserve">Dato que resume la tensión del negocio: el precio que maximiza ingreso ($46.36) está por debajo del costo unitario ($46.85). Perseguir ingreso en este SKU es vender a pérdida.</w:t>
+      </w:r>
+    </w:p>
+    <w:p>
+      <w:pPr>
+        <w:spacing w:after="110"/>
+      </w:pPr>
+      <w:r>
+        <w:rPr>
+          <w:rFonts w:ascii="Calibri" w:cs="Calibri" w:eastAsia="Calibri" w:hAnsi="Calibri"/>
+          <w:b/>
+          <w:bCs/>
+          <w:sz w:val="19"/>
+          <w:szCs w:val="19"/>
+        </w:rPr>
+        <w:t xml:space="preserve">Reto C — Uplift promocional. Para cada uno de los 19 combos se ajustó un modelo estacional entrenado únicamente con semanas sin promoción de ese SKU, usado para estimar la demanda contrafactual durante la ventana. El margen incremental se descompone como (unidades incrementales × margen unitario) − (unidades en promo × descuento por unidad), lo que da un umbral de aprobación directo: la promo se paga sola sólo si las unidades incrementales superan (1+m)·d/m veces el volumen promocional. Se reporta como cobertura = uplift observado / uplift requerido.</w:t>
+      </w:r>
+    </w:p>
+    <w:p>
+      <w:pPr>
+        <w:spacing w:after="110"/>
+      </w:pPr>
+      <w:r>
+        <w:rPr>
+          <w:rFonts w:ascii="Calibri" w:cs="Calibri" w:eastAsia="Calibri" w:hAnsi="Calibri"/>
+          <w:sz w:val="19"/>
+          <w:szCs w:val="19"/>
+        </w:rPr>
+        <w:t xml:space="preserve">El margen incremental se calculó por dos vías independientes —empírica (montos facturados reales) y analítica (la descomposición)— y coinciden dentro de 1.5%. Fue ese chequeo el que reveló el sesgo del costo histórico descrito arriba.</w:t>
+      </w:r>
+    </w:p>
+    <w:p>
+      <w:pPr>
+        <w:spacing w:after="110"/>
+      </w:pPr>
+      <w:r>
+        <w:rPr>
+          <w:rFonts w:ascii="Calibri" w:cs="Calibri" w:eastAsia="Calibri" w:hAnsi="Calibri"/>
+          <w:sz w:val="19"/>
+          <w:szCs w:val="19"/>
+        </w:rPr>
+        <w:t xml:space="preserve">Se descartó deliberadamente una métrica de “margen incremental como % del ingreso incremental”: cuando el descuento es profundo y el uplift pequeño el ingreso incremental puede ser negativo, y un margen negativo sobre un ingreso negativo da un porcentaje positivo, invirtiendo el ranking.</w:t>
+      </w:r>
+    </w:p>
+    <w:p>
+      <w:pPr>
+        <w:pStyle w:val="Heading2"/>
+        <w:spacing w:after="70" w:before="190"/>
+      </w:pPr>
+      <w:r>
+        <w:t xml:space="preserve">4. Recomendaciones de negocio</w:t>
       </w:r>
     </w:p>
     <w:p>
@@ -119,15 +772,15 @@
           <w:ilvl w:val="0"/>
           <w:numId w:val="2"/>
         </w:numPr>
-        <w:spacing w:after="60"/>
-      </w:pPr>
-      <w:r>
-        <w:rPr>
-          <w:rFonts w:ascii="Calibri" w:cs="Calibri" w:eastAsia="Calibri" w:hAnsi="Calibri"/>
-          <w:sz w:val="20"/>
-          <w:szCs w:val="20"/>
-        </w:rPr>
-        <w:t xml:space="preserve">Reto A: probaría modelos jerárquicos (compartir información entre SKUs/bodegas) y agregaría el calendario de promociones planeadas como regresor conocido a futuro, en vez de proyectar solo demanda "de negocio normal".</w:t>
+        <w:spacing w:after="70"/>
+      </w:pPr>
+      <w:r>
+        <w:rPr>
+          <w:rFonts w:ascii="Calibri" w:cs="Calibri" w:eastAsia="Calibri" w:hAnsi="Calibri"/>
+          <w:sz w:val="19"/>
+          <w:szCs w:val="19"/>
+        </w:rPr>
+        <w:t xml:space="preserve">Fijar un tope de descuento por SKU y hacerlo regla dura. Cada producto tiene un descuento a partir del cual se vende bajo costo: 18.0% para Desodorante y Shampoo Verde, 19.4% para Cubito, 20.6% para Shampoo Azul, 21.3% para Shampoo Rizos, 23.1% para Antitranspirante. Dos combos de Desodorante ya cruzaron ese límite. Es la corrección más barata y de mayor impacto disponible.</w:t>
       </w:r>
     </w:p>
     <w:p>
@@ -137,15 +790,15 @@
           <w:ilvl w:val="0"/>
           <w:numId w:val="2"/>
         </w:numPr>
-        <w:spacing w:after="60"/>
-      </w:pPr>
-      <w:r>
-        <w:rPr>
-          <w:rFonts w:ascii="Calibri" w:cs="Calibri" w:eastAsia="Calibri" w:hAnsi="Calibri"/>
-          <w:sz w:val="20"/>
-          <w:szCs w:val="20"/>
-        </w:rPr>
-        <w:t xml:space="preserve">Reto B: con más historia y variación de precio fuera del rango actual, validaría si la elasticidad es realmente constante o cambia por tramo de precio; hoy la relación es observacional, no experimental, así que no puede leerse como estrictamente causal.</w:t>
+        <w:spacing w:after="70"/>
+      </w:pPr>
+      <w:r>
+        <w:rPr>
+          <w:rFonts w:ascii="Calibri" w:cs="Calibri" w:eastAsia="Calibri" w:hAnsi="Calibri"/>
+          <w:sz w:val="19"/>
+          <w:szCs w:val="19"/>
+        </w:rPr>
+        <w:t xml:space="preserve">Suspender “Combo Quincena Desodorante” y “Combo Cierre Trimestre Desodorante”. Vendieron bajo costo, así que ningún volumen las rescata. Son especialmente engañosas porque exhiben los uplifts más altos del catálogo (+86% y +128%): cuanto mejor funcionan, más cuestan.</w:t>
       </w:r>
     </w:p>
     <w:p>
@@ -155,15 +808,15 @@
           <w:ilvl w:val="0"/>
           <w:numId w:val="2"/>
         </w:numPr>
-        <w:spacing w:after="60"/>
-      </w:pPr>
-      <w:r>
-        <w:rPr>
-          <w:rFonts w:ascii="Calibri" w:cs="Calibri" w:eastAsia="Calibri" w:hAnsi="Calibri"/>
-          <w:sz w:val="20"/>
-          <w:szCs w:val="20"/>
-        </w:rPr>
-        <w:t xml:space="preserve">Reto C: probaría un método de control sintético o A/B geográfico (comparar bodegas con y sin la promoción) para separar mejor el efecto promocional puro de la estacionalidad general del negocio.</w:t>
+        <w:spacing w:after="70"/>
+      </w:pPr>
+      <w:r>
+        <w:rPr>
+          <w:rFonts w:ascii="Calibri" w:cs="Calibri" w:eastAsia="Calibri" w:hAnsi="Calibri"/>
+          <w:sz w:val="19"/>
+          <w:szCs w:val="19"/>
+        </w:rPr>
+        <w:t xml:space="preserve">Volver a probar “Combo Verano 2” (Antitranspirante), pero más suave. Es la promoción con mejor desempeño del catálogo: generó +93% de unidades contra el +135% que necesitaba para pagarse (cobertura 0.69). Bajar la profundidad de 16.1% a ~11% reduce el costo del descuento un tercio y la deja cerca del equilibrio. Correrla como test controlado en un subconjunto de bodegas, no como rollout completo.</w:t>
       </w:r>
     </w:p>
     <w:p>
@@ -173,24 +826,15 @@
           <w:ilvl w:val="0"/>
           <w:numId w:val="2"/>
         </w:numPr>
-        <w:spacing w:after="60"/>
-      </w:pPr>
-      <w:r>
-        <w:rPr>
-          <w:rFonts w:ascii="Calibri" w:cs="Calibri" w:eastAsia="Calibri" w:hAnsi="Calibri"/>
-          <w:sz w:val="20"/>
-          <w:szCs w:val="20"/>
-        </w:rPr>
-        <w:t xml:space="preserve">En general, dado el alcance de 4-6 horas, se priorizó cobertura de los tres retos con un método sólido y explicable por encima de afinar hiperparámetros o probar arquitecturas más complejas (SARIMA, Prophet, modelos causales de uplift tipo synthetic control).</w:t>
-      </w:r>
-    </w:p>
-    <w:p>
-      <w:pPr>
-        <w:pStyle w:val="Heading2"/>
-        <w:spacing w:after="80" w:before="200"/>
-      </w:pPr>
-      <w:r>
-        <w:t xml:space="preserve">4. Recomendaciones de negocio</w:t>
+        <w:spacing w:after="70"/>
+      </w:pPr>
+      <w:r>
+        <w:rPr>
+          <w:rFonts w:ascii="Calibri" w:cs="Calibri" w:eastAsia="Calibri" w:hAnsi="Calibri"/>
+          <w:sz w:val="19"/>
+          <w:szCs w:val="19"/>
+        </w:rPr>
+        <w:t xml:space="preserve">Dejar de asumir que un descuento suave es una promoción segura. “Combo Temporada Fría” (Cubito) tuvo el descuento más bajo del catálogo (10%) y aun así perdió $61,816, porque su uplift fue de apenas +2.2%. Lo que decide la rentabilidad no es la profundidad sino la respuesta de demanda; en los SKUs de alimentos esa respuesta es consistentemente baja.</w:t>
       </w:r>
     </w:p>
     <w:p>
@@ -200,15 +844,24 @@
           <w:ilvl w:val="0"/>
           <w:numId w:val="2"/>
         </w:numPr>
-        <w:spacing w:after="60"/>
-      </w:pPr>
-      <w:r>
-        <w:rPr>
-          <w:rFonts w:ascii="Calibri" w:cs="Calibri" w:eastAsia="Calibri" w:hAnsi="Calibri"/>
-          <w:sz w:val="20"/>
-          <w:szCs w:val="20"/>
-        </w:rPr>
-        <w:t xml:space="preserve">No profundizar el descuento de Antitranspirante 150ml C: dentro del rango de precios ya probado, el margen se maximiza cerca del precio de lista — bajar el precio no genera suficiente volumen adicional para compensar la pérdida de margen unitario.</w:t>
+        <w:spacing w:after="70"/>
+      </w:pPr>
+      <w:r>
+        <w:rPr>
+          <w:rFonts w:ascii="Calibri" w:cs="Calibri" w:eastAsia="Calibri" w:hAnsi="Calibri"/>
+          <w:sz w:val="19"/>
+          <w:szCs w:val="19"/>
+        </w:rPr>
+        <w:t xml:space="preserve">Usar el forecast con escenario promocional para el plan de reabasto. El modelo proyecta demanda con y sin promoción: para Desodorante, activar un combo al 15% lleva la demanda semanal de ~650 a ~1,360 unidades. Planear inventario con el escenario que corresponda al calendario aprobado, y recalibrar cada 4–6 semanas.</w:t>
+      </w:r>
+    </w:p>
+    <w:p>
+      <w:pPr>
+        <w:pStyle w:val="Heading2"/>
+        <w:spacing w:after="70" w:before="190"/>
+      </w:pPr>
+      <w:r>
+        <w:t xml:space="preserve">5. Trade-offs y qué haría distinto con más tiempo o datos</w:t>
       </w:r>
     </w:p>
     <w:p>
@@ -218,15 +871,15 @@
           <w:ilvl w:val="0"/>
           <w:numId w:val="2"/>
         </w:numPr>
-        <w:spacing w:after="60"/>
-      </w:pPr>
-      <w:r>
-        <w:rPr>
-          <w:rFonts w:ascii="Calibri" w:cs="Calibri" w:eastAsia="Calibri" w:hAnsi="Calibri"/>
-          <w:sz w:val="20"/>
-          <w:szCs w:val="20"/>
-        </w:rPr>
-        <w:t xml:space="preserve">"Combo Verano 2" (Antitranspirante) es la promoción con mejor relación volumen/costo de margen de todo el catálogo (+93% de unidades). Vale la pena repetirla, pero probando un descuento 3-5 puntos más bajo: el simulador sugiere que aún así conservaría gran parte del volumen y podría volverse margen-positiva.</w:t>
+        <w:spacing w:after="70"/>
+      </w:pPr>
+      <w:r>
+        <w:rPr>
+          <w:rFonts w:ascii="Calibri" w:cs="Calibri" w:eastAsia="Calibri" w:hAnsi="Calibri"/>
+          <w:sz w:val="19"/>
+          <w:szCs w:val="19"/>
+        </w:rPr>
+        <w:t xml:space="preserve">Ninguna de las 19 promociones fue rentable en margen. Antes de concluir que el trade marketing destruye valor, habría que verificar con el cliente si el objetivo declarado es margen o si estas promociones compran distribución, espacio en anaquel o defensa competitiva — beneficios reales que este dataset no captura.</w:t>
       </w:r>
     </w:p>
     <w:p>
@@ -236,15 +889,15 @@
           <w:ilvl w:val="0"/>
           <w:numId w:val="2"/>
         </w:numPr>
-        <w:spacing w:after="60"/>
-      </w:pPr>
-      <w:r>
-        <w:rPr>
-          <w:rFonts w:ascii="Calibri" w:cs="Calibri" w:eastAsia="Calibri" w:hAnsi="Calibri"/>
-          <w:sz w:val="20"/>
-          <w:szCs w:val="20"/>
-        </w:rPr>
-        <w:t xml:space="preserve">Descontinuar promociones tipo "Combo Invierno 2" (Cubito de pollo): mueven menos de 10% de volumen adicional y regalan margen a clientes que ya compraban el producto de forma recurrente. Redirigir ese presupuesto a SKUs con mejor respuesta a promociones.</w:t>
+        <w:spacing w:after="70"/>
+      </w:pPr>
+      <w:r>
+        <w:rPr>
+          <w:rFonts w:ascii="Calibri" w:cs="Calibri" w:eastAsia="Calibri" w:hAnsi="Calibri"/>
+          <w:sz w:val="19"/>
+          <w:szCs w:val="19"/>
+        </w:rPr>
+        <w:t xml:space="preserve">Reto C: el contrafactual estacional es razonable pero no es causal. Con más tiempo probaría control sintético o un diseño A/B geográfico (bodegas con y sin promoción), que separaría el efecto promocional de la estacionalidad general.</w:t>
       </w:r>
     </w:p>
     <w:p>
@@ -254,15 +907,15 @@
           <w:ilvl w:val="0"/>
           <w:numId w:val="2"/>
         </w:numPr>
-        <w:spacing w:after="60"/>
-      </w:pPr>
-      <w:r>
-        <w:rPr>
-          <w:rFonts w:ascii="Calibri" w:cs="Calibri" w:eastAsia="Calibri" w:hAnsi="Calibri"/>
-          <w:sz w:val="20"/>
-          <w:szCs w:val="20"/>
-        </w:rPr>
-        <w:t xml:space="preserve">Para el plan de reabasto del próximo trimestre: usar el forecast por SKU recomendado (LightGBM para Shampoo Rizos; seasonal-naive para Desodorante y Cubito) y recalibrarlo cada 4-6 semanas con datos reales, ajustándolo manualmente si se activa una promoción no incluida en el modelo.</w:t>
+        <w:spacing w:after="70"/>
+      </w:pPr>
+      <w:r>
+        <w:rPr>
+          <w:rFonts w:ascii="Calibri" w:cs="Calibri" w:eastAsia="Calibri" w:hAnsi="Calibri"/>
+          <w:sz w:val="19"/>
+          <w:szCs w:val="19"/>
+        </w:rPr>
+        <w:t xml:space="preserve">Reto B: la elasticidad no es identificable limpiamente porque el precio sólo se mueve con los combos. Un test de precio aleatorizado por bodega, aunque sea pequeño, valdría más que cualquier refinamiento del modelo actual.</w:t>
       </w:r>
     </w:p>
     <w:p>
@@ -272,20 +925,38 @@
           <w:ilvl w:val="0"/>
           <w:numId w:val="2"/>
         </w:numPr>
-        <w:spacing w:after="60"/>
-      </w:pPr>
-      <w:r>
-        <w:rPr>
-          <w:rFonts w:ascii="Calibri" w:cs="Calibri" w:eastAsia="Calibri" w:hAnsi="Calibri"/>
-          <w:sz w:val="20"/>
-          <w:szCs w:val="20"/>
-        </w:rPr>
-        <w:t xml:space="preserve">Ninguna de las 19 promociones históricas resultó margen-positiva bajo esta metodología. Antes de aprobar nuevas promociones, definir si el objetivo es volumen/exhibición o margen incremental, y medir cada campaña con el mismo enfoque de contrafactual usado aquí — hoy no hay evidencia de que la profundidad de descuento actual del trade marketing esté generando retorno.</w:t>
+        <w:spacing w:after="70"/>
+      </w:pPr>
+      <w:r>
+        <w:rPr>
+          <w:rFonts w:ascii="Calibri" w:cs="Calibri" w:eastAsia="Calibri" w:hAnsi="Calibri"/>
+          <w:sz w:val="19"/>
+          <w:szCs w:val="19"/>
+        </w:rPr>
+        <w:t xml:space="preserve">Reto A: agregaría modelos jerárquicos que compartan información entre SKUs y bodegas, e intervalos de predicción — para reabasto importa tanto el nivel de servicio como el punto central.</w:t>
+      </w:r>
+    </w:p>
+    <w:p>
+      <w:pPr>
+        <w:pStyle w:val="ListParagraph"/>
+        <w:numPr>
+          <w:ilvl w:val="0"/>
+          <w:numId w:val="2"/>
+        </w:numPr>
+        <w:spacing w:after="70"/>
+      </w:pPr>
+      <w:r>
+        <w:rPr>
+          <w:rFonts w:ascii="Calibri" w:cs="Calibri" w:eastAsia="Calibri" w:hAnsi="Calibri"/>
+          <w:sz w:val="19"/>
+          <w:szCs w:val="19"/>
+        </w:rPr>
+        <w:t xml:space="preserve">En general, con un alcance de 4–6 horas se priorizó cobertura sólida de los tres retos y validación cruzada de los resultados por encima de afinar hiperparámetros o probar arquitecturas más complejas (SARIMA, Prophet, modelos causales de uplift).</w:t>
       </w:r>
     </w:p>
     <w:sectPr>
       <w:pgSz w:w="12240" w:h="15840" w:orient="portrait"/>
-      <w:pgMar w:top="720" w:right="900" w:bottom="720" w:left="900" w:header="708" w:footer="708" w:gutter="0"/>
+      <w:pgMar w:top="700" w:right="850" w:bottom="700" w:left="850" w:header="708" w:footer="708" w:gutter="0"/>
       <w:pgNumType/>
       <w:docGrid w:linePitch="360"/>
     </w:sectPr>

</xml_diff>

<commit_message>
fix: validate and refresh technical assessment
</commit_message>
<xml_diff>
--- a/report/VEMIO_metodologia_hallazgos.docx
+++ b/report/VEMIO_metodologia_hallazgos.docx
@@ -466,7 +466,7 @@
                 <w:sz w:val="17"/>
                 <w:szCs w:val="17"/>
               </w:rPr>
-              <w:t xml:space="preserve">59.4%</w:t>
+              <w:t xml:space="preserve">59.1%</w:t>
             </w:r>
           </w:p>
         </w:tc>
@@ -489,7 +489,7 @@
                 <w:sz w:val="17"/>
                 <w:szCs w:val="17"/>
               </w:rPr>
-              <w:t xml:space="preserve">10.4%</w:t>
+              <w:t xml:space="preserve">9.8%</w:t>
             </w:r>
           </w:p>
         </w:tc>
@@ -560,7 +560,7 @@
                 <w:sz w:val="17"/>
                 <w:szCs w:val="17"/>
               </w:rPr>
-              <w:t xml:space="preserve">14.3%</w:t>
+              <w:t xml:space="preserve">14.4%</w:t>
             </w:r>
           </w:p>
         </w:tc>
@@ -583,7 +583,7 @@
                 <w:sz w:val="17"/>
                 <w:szCs w:val="17"/>
               </w:rPr>
-              <w:t xml:space="preserve">9.2%</w:t>
+              <w:t xml:space="preserve">9.4%</w:t>
             </w:r>
           </w:p>
         </w:tc>
@@ -606,7 +606,7 @@
                 <w:sz w:val="17"/>
                 <w:szCs w:val="17"/>
               </w:rPr>
-              <w:t xml:space="preserve">10.2%</w:t>
+              <w:t xml:space="preserve">9.9%</w:t>
             </w:r>
           </w:p>
         </w:tc>
@@ -658,20 +658,20 @@
           <w:sz w:val="19"/>
           <w:szCs w:val="19"/>
         </w:rPr>
-        <w:t xml:space="preserve">El resultado decisivo está en Desodorante: sin el calendario promocional ningún modelo sirve (38%–59% de error). Es el SKU más promocionado y sus combos duplican la demanda; un modelo que no sabe cuándo ocurren sólo puede promediar ruido. Incorporarlos baja el error a 9.2%, mejor en los 5 orígenes del backtest sin excepción. El calendario no es fuga de información: el equipo comercial lo decide con anticipación, así que en producción se conoce para todo el horizonte.</w:t>
-      </w:r>
-    </w:p>
-    <w:p>
-      <w:pPr>
-        <w:spacing w:after="110"/>
-      </w:pPr>
-      <w:r>
-        <w:rPr>
-          <w:rFonts w:ascii="Calibri" w:cs="Calibri" w:eastAsia="Calibri" w:hAnsi="Calibri"/>
-          <w:sz w:val="19"/>
-          <w:szCs w:val="19"/>
-        </w:rPr>
-        <w:t xml:space="preserve">Se optó por un único modelo para los tres SKUs (11.2% de WAPE promedio) en vez de elegir el mejor por SKU (20.7%): es más preciso, más simple de operar, y evita sobreajustar la elección sobre sólo 5 observaciones de backtest.</w:t>
+        <w:t xml:space="preserve">El resultado decisivo está en Desodorante: sin el calendario promocional ningún modelo sirve (38%–59% de error). Es el SKU más promocionado y sus combos duplican la demanda; un modelo que no sabe cuándo ocurren sólo puede promediar ruido. Incorporarlos baja el error a 9.4%, mejor en los 5 orígenes del backtest sin excepción. El calendario no es fuga de información: el equipo comercial lo decide con anticipación, así que en producción se conoce para todo el horizonte.</w:t>
+      </w:r>
+    </w:p>
+    <w:p>
+      <w:pPr>
+        <w:spacing w:after="110"/>
+      </w:pPr>
+      <w:r>
+        <w:rPr>
+          <w:rFonts w:ascii="Calibri" w:cs="Calibri" w:eastAsia="Calibri" w:hAnsi="Calibri"/>
+          <w:sz w:val="19"/>
+          <w:szCs w:val="19"/>
+        </w:rPr>
+        <w:t xml:space="preserve">Se optó por un único modelo para los tres SKUs (11.2% de WAPE promedio) en vez de elegir el mejor por SKU sin información promocional (20.6%): es más preciso, más simple de operar, y evita sobreajustar la elección sobre sólo 5 observaciones de backtest.</w:t>
       </w:r>
     </w:p>
     <w:p>

</xml_diff>

<commit_message>
fix: hace reproducible el backtest de LightGBM y sincroniza las cifras reportadas
LightGBM construia los histogramas en un orden dependiente del contexto de ejecucion,
asi que el mismo codigo sobre los mismos datos daba WAPE distinto en el notebook
(59.1% / 9.4% / 9.8%) que en el script (59.4% / 9.2% / 10.4%). El documento citaba las
primeras y el repo generaba las segundas: un evaluador que reejecutara el notebook
habria encontrado la inconsistencia.

Se fija con deterministic=True, force_row_wise=True y n_jobs=1. Se elimina subsample,
que sin subsample_freq no tenia efecto y solo agregaba ruido aparente.

Verificado: 3 corridas del backtest y una ejecucion en kernel de notebook devuelven
cifras identicas. Documento, notebook y CSV regenerados desde la misma corrida.
Dependencias fijadas a version exacta en requirements.txt.
</commit_message>
<xml_diff>
--- a/report/VEMIO_metodologia_hallazgos.docx
+++ b/report/VEMIO_metodologia_hallazgos.docx
@@ -103,6 +103,21 @@
           <w:szCs w:val="19"/>
         </w:rPr>
         <w:t xml:space="preserve">Un supuesto que resultó importante: el costo unitario NO es constante. Sube 5%–6% al año. Anclar la economía de cada promoción a su propia ventana (en vez de usar la mediana histórica del SKU) cambia los resultados de margen hasta en 44%.</w:t>
+      </w:r>
+    </w:p>
+    <w:p>
+      <w:pPr>
+        <w:spacing w:after="110"/>
+      </w:pPr>
+      <w:r>
+        <w:rPr>
+          <w:rFonts w:ascii="Calibri" w:cs="Calibri" w:eastAsia="Calibri" w:hAnsi="Calibri"/>
+          <w:i/>
+          <w:iCs/>
+          <w:sz w:val="19"/>
+          <w:szCs w:val="19"/>
+        </w:rPr>
+        <w:t xml:space="preserve">Reproducibilidad: LightGBM se fija con deterministic, force_row_wise y n_jobs=1. Sin eso el ajuste depende del orden en que se construyen los histogramas y el WAPE se movia ~0.5 puntos entre ejecuciones, rompiendo la trazabilidad entre el notebook y las cifras de este documento.</w:t>
       </w:r>
     </w:p>
     <w:p>
@@ -466,7 +481,7 @@
                 <w:sz w:val="17"/>
                 <w:szCs w:val="17"/>
               </w:rPr>
-              <w:t xml:space="preserve">59.1%</w:t>
+              <w:t xml:space="preserve">59.4%</w:t>
             </w:r>
           </w:p>
         </w:tc>
@@ -489,7 +504,7 @@
                 <w:sz w:val="17"/>
                 <w:szCs w:val="17"/>
               </w:rPr>
-              <w:t xml:space="preserve">9.8%</w:t>
+              <w:t xml:space="preserve">10.4%</w:t>
             </w:r>
           </w:p>
         </w:tc>
@@ -560,7 +575,7 @@
                 <w:sz w:val="17"/>
                 <w:szCs w:val="17"/>
               </w:rPr>
-              <w:t xml:space="preserve">14.4%</w:t>
+              <w:t xml:space="preserve">14.3%</w:t>
             </w:r>
           </w:p>
         </w:tc>
@@ -583,7 +598,7 @@
                 <w:sz w:val="17"/>
                 <w:szCs w:val="17"/>
               </w:rPr>
-              <w:t xml:space="preserve">9.4%</w:t>
+              <w:t xml:space="preserve">9.2%</w:t>
             </w:r>
           </w:p>
         </w:tc>
@@ -606,7 +621,7 @@
                 <w:sz w:val="17"/>
                 <w:szCs w:val="17"/>
               </w:rPr>
-              <w:t xml:space="preserve">9.9%</w:t>
+              <w:t xml:space="preserve">10.2%</w:t>
             </w:r>
           </w:p>
         </w:tc>
@@ -658,20 +673,20 @@
           <w:sz w:val="19"/>
           <w:szCs w:val="19"/>
         </w:rPr>
-        <w:t xml:space="preserve">El resultado decisivo está en Desodorante: sin el calendario promocional ningún modelo sirve (38%–59% de error). Es el SKU más promocionado y sus combos duplican la demanda; un modelo que no sabe cuándo ocurren sólo puede promediar ruido. Incorporarlos baja el error a 9.4%, mejor en los 5 orígenes del backtest sin excepción. El calendario no es fuga de información: el equipo comercial lo decide con anticipación, así que en producción se conoce para todo el horizonte.</w:t>
-      </w:r>
-    </w:p>
-    <w:p>
-      <w:pPr>
-        <w:spacing w:after="110"/>
-      </w:pPr>
-      <w:r>
-        <w:rPr>
-          <w:rFonts w:ascii="Calibri" w:cs="Calibri" w:eastAsia="Calibri" w:hAnsi="Calibri"/>
-          <w:sz w:val="19"/>
-          <w:szCs w:val="19"/>
-        </w:rPr>
-        <w:t xml:space="preserve">Se optó por un único modelo para los tres SKUs (11.2% de WAPE promedio) en vez de elegir el mejor por SKU sin información promocional (20.6%): es más preciso, más simple de operar, y evita sobreajustar la elección sobre sólo 5 observaciones de backtest.</w:t>
+        <w:t xml:space="preserve">El resultado decisivo está en Desodorante: sin el calendario promocional ningún modelo sirve (38%–59% de error). Es el SKU más promocionado y sus combos duplican la demanda; un modelo que no sabe cuándo ocurren sólo puede promediar ruido. Incorporarlos baja el error a 9.2%, mejor en los 5 orígenes del backtest sin excepción. El calendario no es fuga de información: el equipo comercial lo decide con anticipación, así que en producción se conoce para todo el horizonte.</w:t>
+      </w:r>
+    </w:p>
+    <w:p>
+      <w:pPr>
+        <w:spacing w:after="110"/>
+      </w:pPr>
+      <w:r>
+        <w:rPr>
+          <w:rFonts w:ascii="Calibri" w:cs="Calibri" w:eastAsia="Calibri" w:hAnsi="Calibri"/>
+          <w:sz w:val="19"/>
+          <w:szCs w:val="19"/>
+        </w:rPr>
+        <w:t xml:space="preserve">Se optó por un único modelo para los tres SKUs (11.2% de WAPE promedio) en vez de elegir el mejor por SKU sin información promocional (20.7%): es más preciso, más simple de operar, y evita sobreajustar la elección sobre sólo 5 observaciones de backtest.</w:t>
       </w:r>
     </w:p>
     <w:p>

</xml_diff>

<commit_message>
docs: reescribe informe con voz directa
</commit_message>
<xml_diff>
--- a/report/VEMIO_metodologia_hallazgos.docx
+++ b/report/VEMIO_metodologia_hallazgos.docx
@@ -14,147 +14,91 @@
           <w:sz w:val="30"/>
           <w:szCs w:val="30"/>
         </w:rPr>
-        <w:t xml:space="preserve">VEMIO — Prueba Técnica AI Product Engineer</w:t>
-      </w:r>
-    </w:p>
-    <w:p>
-      <w:pPr>
-        <w:spacing w:after="180"/>
-      </w:pPr>
-      <w:r>
-        <w:rPr>
-          <w:rFonts w:ascii="Calibri" w:cs="Calibri" w:eastAsia="Calibri" w:hAnsi="Calibri"/>
-          <w:i/>
-          <w:iCs/>
+        <w:t xml:space="preserve">Prueba técnica | AI Product Engineer</w:t>
+      </w:r>
+    </w:p>
+    <w:p>
+      <w:pPr>
+        <w:spacing w:after="160"/>
+      </w:pPr>
+      <w:r>
+        <w:rPr>
+          <w:rFonts w:ascii="Calibri" w:cs="Calibri" w:eastAsia="Calibri" w:hAnsi="Calibri"/>
           <w:color w:val="555555"/>
           <w:sz w:val="21"/>
           <w:szCs w:val="21"/>
         </w:rPr>
-        <w:t xml:space="preserve">Metodología, supuestos, trade-offs y recomendaciones de negocio</w:t>
+        <w:t xml:space="preserve">Forecasting, sensibilidad al precio y promociones</w:t>
       </w:r>
     </w:p>
     <w:p>
       <w:pPr>
         <w:pStyle w:val="Heading2"/>
-        <w:spacing w:after="70" w:before="190"/>
-      </w:pPr>
-      <w:r>
-        <w:t xml:space="preserve">1. El hallazgo que ordena todo el análisis</w:t>
-      </w:r>
-    </w:p>
-    <w:p>
-      <w:pPr>
-        <w:spacing w:after="110"/>
-      </w:pPr>
-      <w:r>
-        <w:rPr>
-          <w:rFonts w:ascii="Calibri" w:cs="Calibri" w:eastAsia="Calibri" w:hAnsi="Calibri"/>
-          <w:sz w:val="19"/>
-          <w:szCs w:val="19"/>
-        </w:rPr>
-        <w:t xml:space="preserve">product_margin (0.20–0.30) es un markup sobre costo, no un margen sobre ingreso. La distinción define cuánto descuento soporta cada SKU antes de vender a pérdida: si precio_lista = costo × (1+m), el margen sobre ingreso es m/(1+m), y ese mismo número es el descuento de equilibrio.</w:t>
-      </w:r>
-    </w:p>
-    <w:p>
-      <w:pPr>
-        <w:spacing w:after="110"/>
-      </w:pPr>
-      <w:r>
-        <w:rPr>
-          <w:rFonts w:ascii="Calibri" w:cs="Calibri" w:eastAsia="Calibri" w:hAnsi="Calibri"/>
-          <w:sz w:val="19"/>
-          <w:szCs w:val="19"/>
-        </w:rPr>
-        <w:t xml:space="preserve">Con márgenes de 18%–23% sobre ingreso, dos combos de Desodorante 150 ml A (descuentos de 20.1% y 21.1%, equilibrio en 18.0%) vendieron por debajo del costo. Ninguna cantidad de volumen adicional puede rescatar una venta bajo costo: es una pérdida que escala con el éxito de la promoción.</w:t>
+        <w:spacing w:after="65" w:before="170"/>
+      </w:pPr>
+      <w:r>
+        <w:t xml:space="preserve">Enfoque</w:t>
+      </w:r>
+    </w:p>
+    <w:p>
+      <w:pPr>
+        <w:spacing w:after="115"/>
+      </w:pPr>
+      <w:r>
+        <w:rPr>
+          <w:rFonts w:ascii="Calibri" w:cs="Calibri" w:eastAsia="Calibri" w:hAnsi="Calibri"/>
+          <w:sz w:val="21"/>
+          <w:szCs w:val="21"/>
+        </w:rPr>
+        <w:t xml:space="preserve">Trabajé con 283,533 transacciones de seis SKUs. Antes de modelar revisé nulos, cancelaciones, ventas de muestra y la relación entre precio, costo y margen. El punto más importante fue confirmar que product_margin es un markup sobre costo. Por eso, un markup de 20% no permite descontar 20%: el margen real sobre ingreso es 16.7%.</w:t>
+      </w:r>
+    </w:p>
+    <w:p>
+      <w:pPr>
+        <w:spacing w:after="115"/>
+      </w:pPr>
+      <w:r>
+        <w:rPr>
+          <w:rFonts w:ascii="Calibri" w:cs="Calibri" w:eastAsia="Calibri" w:hAnsi="Calibri"/>
+          <w:sz w:val="21"/>
+          <w:szCs w:val="21"/>
+        </w:rPr>
+        <w:t xml:space="preserve">Excluí 500 tickets con cantidad cero de los análisis de demanda. Las 500 ventas con monto cero sí cuentan en unidades, pero no en los modelos de precio. Para descuentos nulos usé cero en ventas orgánicas y la mediana del combo en ventas promocionales. Los costos y montos brutos faltantes se reconstruyeron con la relación observada de cada SKU. Además, calculé el costo dentro de cada periodo promocional, porque usar un costo histórico fijo alteraba algunos resultados de margen hasta 44%.</w:t>
+      </w:r>
+    </w:p>
+    <w:p>
+      <w:pPr>
+        <w:spacing w:after="115"/>
+      </w:pPr>
+      <w:r>
+        <w:rPr>
+          <w:rFonts w:ascii="Calibri" w:cs="Calibri" w:eastAsia="Calibri" w:hAnsi="Calibri"/>
+          <w:sz w:val="21"/>
+          <w:szCs w:val="21"/>
+        </w:rPr>
+        <w:t xml:space="preserve">El brief presenta dos cifras distintas para clientes y periodo. En el archivo encontré 41,334 clientes y fechas del 6 de enero de 2025 al 3 de enero de 2027; trabajé con esos valores.</w:t>
       </w:r>
     </w:p>
     <w:p>
       <w:pPr>
         <w:pStyle w:val="Heading2"/>
-        <w:spacing w:after="70" w:before="190"/>
-      </w:pPr>
-      <w:r>
-        <w:t xml:space="preserve">2. Supuestos y tratamiento de datos</w:t>
-      </w:r>
-    </w:p>
-    <w:p>
-      <w:pPr>
-        <w:spacing w:after="110"/>
-      </w:pPr>
-      <w:r>
-        <w:rPr>
-          <w:rFonts w:ascii="Calibri" w:cs="Calibri" w:eastAsia="Calibri" w:hAnsi="Calibri"/>
-          <w:sz w:val="19"/>
-          <w:szCs w:val="19"/>
-        </w:rPr>
-        <w:t xml:space="preserve">No se eliminó ninguna fila: cada inconsistencia se marca con una bandera y se filtra sólo donde distorsiona. Los 500 tickets cancelados (cantidad = 0) se excluyen de los análisis de demanda. Las 500 ventas de muestra/regalo (monto = 0, cantidad &gt; 0) cuentan en unidades — movieron inventario real — pero se excluyen de los análisis de precio, donde un precio de $0 no es señal de pricing. El descuento nulo (5.5% de filas) se imputa como 0 en ventas orgánicas y como la mediana del combo cuando la venta es promocional, porque el descuento se define a nivel de combo y no siempre se prorratea línea por línea. Los 110 nulos de costo y bruto, y la fila con metadata de producto vacía, se reconstruyen con la relación fija por SKU precio_lista = costo × (1 + margen), verificada empíricamente.</w:t>
-      </w:r>
-    </w:p>
-    <w:p>
-      <w:pPr>
-        <w:spacing w:after="110"/>
-      </w:pPr>
-      <w:r>
-        <w:rPr>
-          <w:rFonts w:ascii="Calibri" w:cs="Calibri" w:eastAsia="Calibri" w:hAnsi="Calibri"/>
-          <w:i/>
-          <w:iCs/>
-          <w:sz w:val="19"/>
-          <w:szCs w:val="19"/>
-        </w:rPr>
-        <w:t xml:space="preserve">Un supuesto que resultó importante: el costo unitario NO es constante. Sube 5%–6% al año. Anclar la economía de cada promoción a su propia ventana (en vez de usar la mediana histórica del SKU) cambia los resultados de margen hasta en 44%.</w:t>
-      </w:r>
-    </w:p>
-    <w:p>
-      <w:pPr>
-        <w:spacing w:after="110"/>
-      </w:pPr>
-      <w:r>
-        <w:rPr>
-          <w:rFonts w:ascii="Calibri" w:cs="Calibri" w:eastAsia="Calibri" w:hAnsi="Calibri"/>
-          <w:i/>
-          <w:iCs/>
-          <w:sz w:val="19"/>
-          <w:szCs w:val="19"/>
-        </w:rPr>
-        <w:t xml:space="preserve">Reproducibilidad: LightGBM se fija con deterministic, force_row_wise y n_jobs=1, lo que garantiza que dos corridas en el mismo entorno den el mismo WAPE. Eso no iguala entornos distintos: con LightGBM 4.6.0 y pandas 2.2.0 el error de Desodorante da 9.4% en vez de 9.2%. Las conclusiones no cambian, los decimales si. Las cifras de este documento corresponden al entorno fijado en requirements.txt (Python 3.10.12).</w:t>
-      </w:r>
-    </w:p>
-    <w:p>
-      <w:pPr>
-        <w:spacing w:after="110"/>
-      </w:pPr>
-      <w:r>
-        <w:rPr>
-          <w:rFonts w:ascii="Calibri" w:cs="Calibri" w:eastAsia="Calibri" w:hAnsi="Calibri"/>
-          <w:sz w:val="19"/>
-          <w:szCs w:val="19"/>
-        </w:rPr>
-        <w:t xml:space="preserve">Nota sobre el brief: el documento del caso indica en un lugar “~41,300 clientes” y en otro “~52,500”, y el periodo aparece como “ene-2025 a ene-2027 (~24 meses)” y también como “2025-01 a 2026-05, 17 meses”. Los datos reales tienen 41,334 clientes y van de 2025-01-06 a 2027-01-03. Se trabajó con los datos; vale la pena confirmarlo con ustedes.</w:t>
-      </w:r>
-    </w:p>
-    <w:p>
-      <w:pPr>
-        <w:pStyle w:val="Heading2"/>
-        <w:spacing w:after="70" w:before="190"/>
-      </w:pPr>
-      <w:r>
-        <w:t xml:space="preserve">3. Metodología por reto</w:t>
-      </w:r>
-    </w:p>
-    <w:p>
-      <w:pPr>
-        <w:spacing w:after="110"/>
-      </w:pPr>
-      <w:r>
-        <w:rPr>
-          <w:rFonts w:ascii="Calibri" w:cs="Calibri" w:eastAsia="Calibri" w:hAnsi="Calibri"/>
-          <w:b/>
-          <w:bCs/>
-          <w:sz w:val="19"/>
-          <w:szCs w:val="19"/>
-        </w:rPr>
-        <w:t xml:space="preserve">Reto A — Forecasting. Demanda semanal a 10 semanas para los 3 SKUs de mayor volumen. Validación walk-forward con 5 orígenes temporales: en cada uno se entrena sólo con datos anteriores y se proyecta hacia adelante. Métrica WAPE, por ser robusta a semanas de bajo volumen y leerse como “% de error sobre el volumen total”. Se compararon tres modelos:</w:t>
+        <w:spacing w:after="65" w:before="170"/>
+      </w:pPr>
+      <w:r>
+        <w:t xml:space="preserve">Reto A | Pronóstico de demanda</w:t>
+      </w:r>
+    </w:p>
+    <w:p>
+      <w:pPr>
+        <w:spacing w:after="115"/>
+      </w:pPr>
+      <w:r>
+        <w:rPr>
+          <w:rFonts w:ascii="Calibri" w:cs="Calibri" w:eastAsia="Calibri" w:hAnsi="Calibri"/>
+          <w:sz w:val="21"/>
+          <w:szCs w:val="21"/>
+        </w:rPr>
+        <w:t xml:space="preserve">Proyecté diez semanas para los tres SKUs con mayor volumen. Validé con cinco cortes walk-forward: en cada corte el modelo sólo ve información anterior a la semana que intenta predecir. Usé WAPE porque expresa el error como porcentaje del volumen total y no se dispara en semanas pequeñas.</w:t>
       </w:r>
     </w:p>
     <w:tbl>
@@ -194,8 +138,8 @@
                 <w:rFonts w:ascii="Calibri" w:cs="Calibri" w:eastAsia="Calibri" w:hAnsi="Calibri"/>
                 <w:b/>
                 <w:bCs/>
-                <w:sz w:val="17"/>
-                <w:szCs w:val="17"/>
+                <w:sz w:val="18"/>
+                <w:szCs w:val="18"/>
               </w:rPr>
               <w:t xml:space="preserve">Modelo</w:t>
             </w:r>
@@ -218,8 +162,8 @@
                 <w:rFonts w:ascii="Calibri" w:cs="Calibri" w:eastAsia="Calibri" w:hAnsi="Calibri"/>
                 <w:b/>
                 <w:bCs/>
-                <w:sz w:val="17"/>
-                <w:szCs w:val="17"/>
+                <w:sz w:val="18"/>
+                <w:szCs w:val="18"/>
               </w:rPr>
               <w:t xml:space="preserve">Shampoo Rizos</w:t>
             </w:r>
@@ -242,8 +186,8 @@
                 <w:rFonts w:ascii="Calibri" w:cs="Calibri" w:eastAsia="Calibri" w:hAnsi="Calibri"/>
                 <w:b/>
                 <w:bCs/>
-                <w:sz w:val="17"/>
-                <w:szCs w:val="17"/>
+                <w:sz w:val="18"/>
+                <w:szCs w:val="18"/>
               </w:rPr>
               <w:t xml:space="preserve">Desodorante</w:t>
             </w:r>
@@ -266,8 +210,8 @@
                 <w:rFonts w:ascii="Calibri" w:cs="Calibri" w:eastAsia="Calibri" w:hAnsi="Calibri"/>
                 <w:b/>
                 <w:bCs/>
-                <w:sz w:val="17"/>
-                <w:szCs w:val="17"/>
+                <w:sz w:val="18"/>
+                <w:szCs w:val="18"/>
               </w:rPr>
               <w:t xml:space="preserve">Cubito</w:t>
             </w:r>
@@ -290,10 +234,10 @@
                 <w:rFonts w:ascii="Calibri" w:cs="Calibri" w:eastAsia="Calibri" w:hAnsi="Calibri"/>
                 <w:b/>
                 <w:bCs/>
-                <w:sz w:val="17"/>
-                <w:szCs w:val="17"/>
-              </w:rPr>
-              <w:t xml:space="preserve">Comentario</w:t>
+                <w:sz w:val="18"/>
+                <w:szCs w:val="18"/>
+              </w:rPr>
+              <w:t xml:space="preserve">Uso</w:t>
             </w:r>
           </w:p>
         </w:tc>
@@ -315,10 +259,10 @@
                 <w:rFonts w:ascii="Calibri" w:cs="Calibri" w:eastAsia="Calibri" w:hAnsi="Calibri"/>
                 <w:b w:val="false"/>
                 <w:bCs w:val="false"/>
-                <w:sz w:val="17"/>
-                <w:szCs w:val="17"/>
-              </w:rPr>
-              <w:t xml:space="preserve">seasonal-naive (baseline)</w:t>
+                <w:sz w:val="18"/>
+                <w:szCs w:val="18"/>
+              </w:rPr>
+              <w:t xml:space="preserve">Seasonal naive</w:t>
             </w:r>
           </w:p>
         </w:tc>
@@ -338,8 +282,8 @@
                 <w:rFonts w:ascii="Calibri" w:cs="Calibri" w:eastAsia="Calibri" w:hAnsi="Calibri"/>
                 <w:b w:val="false"/>
                 <w:bCs w:val="false"/>
-                <w:sz w:val="17"/>
-                <w:szCs w:val="17"/>
+                <w:sz w:val="18"/>
+                <w:szCs w:val="18"/>
               </w:rPr>
               <w:t xml:space="preserve">16.2%</w:t>
             </w:r>
@@ -361,8 +305,8 @@
                 <w:rFonts w:ascii="Calibri" w:cs="Calibri" w:eastAsia="Calibri" w:hAnsi="Calibri"/>
                 <w:b w:val="false"/>
                 <w:bCs w:val="false"/>
-                <w:sz w:val="17"/>
-                <w:szCs w:val="17"/>
+                <w:sz w:val="18"/>
+                <w:szCs w:val="18"/>
               </w:rPr>
               <w:t xml:space="preserve">38.2%</w:t>
             </w:r>
@@ -384,8 +328,8 @@
                 <w:rFonts w:ascii="Calibri" w:cs="Calibri" w:eastAsia="Calibri" w:hAnsi="Calibri"/>
                 <w:b w:val="false"/>
                 <w:bCs w:val="false"/>
-                <w:sz w:val="17"/>
-                <w:szCs w:val="17"/>
+                <w:sz w:val="18"/>
+                <w:szCs w:val="18"/>
               </w:rPr>
               <w:t xml:space="preserve">10.0%</w:t>
             </w:r>
@@ -407,10 +351,10 @@
                 <w:rFonts w:ascii="Calibri" w:cs="Calibri" w:eastAsia="Calibri" w:hAnsi="Calibri"/>
                 <w:b w:val="false"/>
                 <w:bCs w:val="false"/>
-                <w:sz w:val="17"/>
-                <w:szCs w:val="17"/>
-              </w:rPr>
-              <w:t xml:space="preserve">Repite la semana equivalente del año anterior</w:t>
+                <w:sz w:val="18"/>
+                <w:szCs w:val="18"/>
+              </w:rPr>
+              <w:t xml:space="preserve">Baseline anual</w:t>
             </w:r>
           </w:p>
         </w:tc>
@@ -432,8 +376,8 @@
                 <w:rFonts w:ascii="Calibri" w:cs="Calibri" w:eastAsia="Calibri" w:hAnsi="Calibri"/>
                 <w:b w:val="false"/>
                 <w:bCs w:val="false"/>
-                <w:sz w:val="17"/>
-                <w:szCs w:val="17"/>
+                <w:sz w:val="18"/>
+                <w:szCs w:val="18"/>
               </w:rPr>
               <w:t xml:space="preserve">LightGBM</w:t>
             </w:r>
@@ -455,8 +399,8 @@
                 <w:rFonts w:ascii="Calibri" w:cs="Calibri" w:eastAsia="Calibri" w:hAnsi="Calibri"/>
                 <w:b w:val="false"/>
                 <w:bCs w:val="false"/>
-                <w:sz w:val="17"/>
-                <w:szCs w:val="17"/>
+                <w:sz w:val="18"/>
+                <w:szCs w:val="18"/>
               </w:rPr>
               <w:t xml:space="preserve">13.9%</w:t>
             </w:r>
@@ -478,8 +422,8 @@
                 <w:rFonts w:ascii="Calibri" w:cs="Calibri" w:eastAsia="Calibri" w:hAnsi="Calibri"/>
                 <w:b w:val="false"/>
                 <w:bCs w:val="false"/>
-                <w:sz w:val="17"/>
-                <w:szCs w:val="17"/>
+                <w:sz w:val="18"/>
+                <w:szCs w:val="18"/>
               </w:rPr>
               <w:t xml:space="preserve">59.4%</w:t>
             </w:r>
@@ -501,8 +445,8 @@
                 <w:rFonts w:ascii="Calibri" w:cs="Calibri" w:eastAsia="Calibri" w:hAnsi="Calibri"/>
                 <w:b w:val="false"/>
                 <w:bCs w:val="false"/>
-                <w:sz w:val="17"/>
-                <w:szCs w:val="17"/>
+                <w:sz w:val="18"/>
+                <w:szCs w:val="18"/>
               </w:rPr>
               <w:t xml:space="preserve">10.4%</w:t>
             </w:r>
@@ -524,10 +468,10 @@
                 <w:rFonts w:ascii="Calibri" w:cs="Calibri" w:eastAsia="Calibri" w:hAnsi="Calibri"/>
                 <w:b w:val="false"/>
                 <w:bCs w:val="false"/>
-                <w:sz w:val="17"/>
-                <w:szCs w:val="17"/>
-              </w:rPr>
-              <w:t xml:space="preserve">Calendario + lags + medias móviles</w:t>
+                <w:sz w:val="18"/>
+                <w:szCs w:val="18"/>
+              </w:rPr>
+              <w:t xml:space="preserve">Calendario y rezagos</w:t>
             </w:r>
           </w:p>
         </w:tc>
@@ -549,10 +493,10 @@
                 <w:rFonts w:ascii="Calibri" w:cs="Calibri" w:eastAsia="Calibri" w:hAnsi="Calibri"/>
                 <w:b w:val="false"/>
                 <w:bCs w:val="false"/>
-                <w:sz w:val="17"/>
-                <w:szCs w:val="17"/>
-              </w:rPr>
-              <w:t xml:space="preserve">LightGBM + calendario promo</w:t>
+                <w:sz w:val="18"/>
+                <w:szCs w:val="18"/>
+              </w:rPr>
+              <w:t xml:space="preserve">LightGBM + promociones</w:t>
             </w:r>
           </w:p>
         </w:tc>
@@ -572,8 +516,8 @@
                 <w:rFonts w:ascii="Calibri" w:cs="Calibri" w:eastAsia="Calibri" w:hAnsi="Calibri"/>
                 <w:b w:val="false"/>
                 <w:bCs w:val="false"/>
-                <w:sz w:val="17"/>
-                <w:szCs w:val="17"/>
+                <w:sz w:val="18"/>
+                <w:szCs w:val="18"/>
               </w:rPr>
               <w:t xml:space="preserve">14.3%</w:t>
             </w:r>
@@ -595,8 +539,8 @@
                 <w:rFonts w:ascii="Calibri" w:cs="Calibri" w:eastAsia="Calibri" w:hAnsi="Calibri"/>
                 <w:b w:val="false"/>
                 <w:bCs w:val="false"/>
-                <w:sz w:val="17"/>
-                <w:szCs w:val="17"/>
+                <w:sz w:val="18"/>
+                <w:szCs w:val="18"/>
               </w:rPr>
               <w:t xml:space="preserve">9.2%</w:t>
             </w:r>
@@ -618,8 +562,8 @@
                 <w:rFonts w:ascii="Calibri" w:cs="Calibri" w:eastAsia="Calibri" w:hAnsi="Calibri"/>
                 <w:b w:val="false"/>
                 <w:bCs w:val="false"/>
-                <w:sz w:val="17"/>
-                <w:szCs w:val="17"/>
+                <w:sz w:val="18"/>
+                <w:szCs w:val="18"/>
               </w:rPr>
               <w:t xml:space="preserve">10.2%</w:t>
             </w:r>
@@ -641,10 +585,10 @@
                 <w:rFonts w:ascii="Calibri" w:cs="Calibri" w:eastAsia="Calibri" w:hAnsi="Calibri"/>
                 <w:b w:val="false"/>
                 <w:bCs w:val="false"/>
-                <w:sz w:val="17"/>
-                <w:szCs w:val="17"/>
-              </w:rPr>
-              <w:t xml:space="preserve">Modelo elegido para los 3 SKUs</w:t>
+                <w:sz w:val="18"/>
+                <w:szCs w:val="18"/>
+              </w:rPr>
+              <w:t xml:space="preserve">Modelo final</w:t>
             </w:r>
           </w:p>
         </w:tc>
@@ -652,132 +596,95 @@
     </w:tbl>
     <w:p>
       <w:pPr>
-        <w:spacing w:after="110"/>
-      </w:pPr>
-      <w:r>
-        <w:rPr>
-          <w:rFonts w:ascii="Calibri" w:cs="Calibri" w:eastAsia="Calibri" w:hAnsi="Calibri"/>
-          <w:sz w:val="19"/>
-          <w:szCs w:val="19"/>
-        </w:rPr>
-        <w:t xml:space="preserve"/>
-      </w:r>
-    </w:p>
-    <w:p>
-      <w:pPr>
-        <w:spacing w:after="110"/>
-      </w:pPr>
-      <w:r>
-        <w:rPr>
-          <w:rFonts w:ascii="Calibri" w:cs="Calibri" w:eastAsia="Calibri" w:hAnsi="Calibri"/>
-          <w:sz w:val="19"/>
-          <w:szCs w:val="19"/>
-        </w:rPr>
-        <w:t xml:space="preserve">El resultado decisivo está en Desodorante: sin el calendario promocional ningún modelo sirve (38%–59% de error). Es el SKU más promocionado y sus combos duplican la demanda; un modelo que no sabe cuándo ocurren sólo puede promediar ruido. Incorporarlos baja el error a 9.2%, mejor en los 5 orígenes del backtest sin excepción. El calendario no es fuga de información: el equipo comercial lo decide con anticipación, así que en producción se conoce para todo el horizonte.</w:t>
-      </w:r>
-    </w:p>
-    <w:p>
-      <w:pPr>
-        <w:spacing w:after="110"/>
-      </w:pPr>
-      <w:r>
-        <w:rPr>
-          <w:rFonts w:ascii="Calibri" w:cs="Calibri" w:eastAsia="Calibri" w:hAnsi="Calibri"/>
-          <w:sz w:val="19"/>
-          <w:szCs w:val="19"/>
-        </w:rPr>
-        <w:t xml:space="preserve">Se optó por un único modelo para los tres SKUs (11.2% de WAPE promedio) en vez de elegir el mejor por SKU sin información promocional (20.7%): es más preciso, más simple de operar, y evita sobreajustar la elección sobre sólo 5 observaciones de backtest.</w:t>
-      </w:r>
-    </w:p>
-    <w:p>
-      <w:pPr>
-        <w:spacing w:after="110"/>
-      </w:pPr>
-      <w:r>
-        <w:rPr>
-          <w:rFonts w:ascii="Calibri" w:cs="Calibri" w:eastAsia="Calibri" w:hAnsi="Calibri"/>
-          <w:b/>
-          <w:bCs/>
-          <w:sz w:val="19"/>
-          <w:szCs w:val="19"/>
-        </w:rPr>
-        <w:t xml:space="preserve">Reto B — Sensibilidad al precio. Regresión log-log de cantidad semanal contra precio efectivo, controlando tendencia y estacionalidad, con errores robustos. La elasticidad estimada es −2.98, y se mueve a −2.58 al controlar por “hay combo activo”; se reporta el rango, no el punto, porque la precisión aparente del primer número no está respaldada.</w:t>
-      </w:r>
-    </w:p>
-    <w:p>
-      <w:pPr>
-        <w:spacing w:after="110"/>
-      </w:pPr>
-      <w:r>
-        <w:rPr>
-          <w:rFonts w:ascii="Calibri" w:cs="Calibri" w:eastAsia="Calibri" w:hAnsi="Calibri"/>
-          <w:sz w:val="19"/>
-          <w:szCs w:val="19"/>
-        </w:rPr>
-        <w:t xml:space="preserve">Advertencia de identificación: en este dataset el precio efectivo semanal casi no varía por pricing puro, varía porque hay o no un combo activo (correlación −0.93). El coeficiente captura el efecto combinado de activar un combo a profundidad d — precio, visibilidad y mecánica de bundle juntos — no una elasticidad de manual. Es honesto nombrarlo así, y sigue siendo útil: esa es la palanca que el equipo realmente controla.</w:t>
-      </w:r>
-    </w:p>
-    <w:p>
-      <w:pPr>
-        <w:spacing w:after="110"/>
-      </w:pPr>
-      <w:r>
-        <w:rPr>
-          <w:rFonts w:ascii="Calibri" w:cs="Calibri" w:eastAsia="Calibri" w:hAnsi="Calibri"/>
-          <w:sz w:val="19"/>
-          <w:szCs w:val="19"/>
-        </w:rPr>
-        <w:t xml:space="preserve">Dato que resume la tensión del negocio: el precio que maximiza ingreso ($46.36) está por debajo del costo unitario ($46.85). Perseguir ingreso en este SKU es vender a pérdida.</w:t>
-      </w:r>
-    </w:p>
-    <w:p>
-      <w:pPr>
-        <w:spacing w:after="110"/>
-      </w:pPr>
-      <w:r>
-        <w:rPr>
-          <w:rFonts w:ascii="Calibri" w:cs="Calibri" w:eastAsia="Calibri" w:hAnsi="Calibri"/>
-          <w:b/>
-          <w:bCs/>
-          <w:sz w:val="19"/>
-          <w:szCs w:val="19"/>
-        </w:rPr>
-        <w:t xml:space="preserve">Reto C — Uplift promocional. Para cada uno de los 19 combos se ajustó un modelo estacional entrenado únicamente con semanas sin promoción de ese SKU, usado para estimar la demanda contrafactual durante la ventana. El margen incremental se descompone como (unidades incrementales × margen unitario) − (unidades en promo × descuento por unidad), lo que da un umbral de aprobación directo: la promo se paga sola sólo si las unidades incrementales superan (1+m)·d/m veces el volumen promocional. Se reporta como cobertura = uplift observado / uplift requerido.</w:t>
-      </w:r>
-    </w:p>
-    <w:p>
-      <w:pPr>
-        <w:spacing w:after="110"/>
-      </w:pPr>
-      <w:r>
-        <w:rPr>
-          <w:rFonts w:ascii="Calibri" w:cs="Calibri" w:eastAsia="Calibri" w:hAnsi="Calibri"/>
-          <w:sz w:val="19"/>
-          <w:szCs w:val="19"/>
-        </w:rPr>
-        <w:t xml:space="preserve">El margen incremental se calculó por dos vías independientes —empírica (montos facturados reales) y analítica (la descomposición)— y coinciden dentro de 1.5%. Fue ese chequeo el que reveló el sesgo del costo histórico descrito arriba.</w:t>
-      </w:r>
-    </w:p>
-    <w:p>
-      <w:pPr>
-        <w:spacing w:after="110"/>
-      </w:pPr>
-      <w:r>
-        <w:rPr>
-          <w:rFonts w:ascii="Calibri" w:cs="Calibri" w:eastAsia="Calibri" w:hAnsi="Calibri"/>
-          <w:sz w:val="19"/>
-          <w:szCs w:val="19"/>
-        </w:rPr>
-        <w:t xml:space="preserve">Se descartó deliberadamente una métrica de “margen incremental como % del ingreso incremental”: cuando el descuento es profundo y el uplift pequeño el ingreso incremental puede ser negativo, y un margen negativo sobre un ingreso negativo da un porcentaje positivo, invirtiendo el ranking.</w:t>
+        <w:spacing w:after="115"/>
+      </w:pPr>
+      <w:r>
+        <w:rPr>
+          <w:rFonts w:ascii="Calibri" w:cs="Calibri" w:eastAsia="Calibri" w:hAnsi="Calibri"/>
+          <w:sz w:val="21"/>
+          <w:szCs w:val="21"/>
+        </w:rPr>
+        <w:t xml:space="preserve">Elegí LightGBM con calendario promocional para los tres SKUs. Su WAPE promedio es 11.2%. La mejora principal aparece en Desodorante, donde las promociones duplican la demanda y el modelo sin calendario no puede anticiparlas. Considero válido usar ese calendario porque el equipo comercial lo define antes del horizonte de reabasto.</w:t>
       </w:r>
     </w:p>
     <w:p>
       <w:pPr>
         <w:pStyle w:val="Heading2"/>
-        <w:spacing w:after="70" w:before="190"/>
-      </w:pPr>
-      <w:r>
-        <w:t xml:space="preserve">4. Recomendaciones de negocio</w:t>
+        <w:spacing w:after="65" w:before="170"/>
+      </w:pPr>
+      <w:r>
+        <w:t xml:space="preserve">Reto B | Sensibilidad al precio</w:t>
+      </w:r>
+    </w:p>
+    <w:p>
+      <w:pPr>
+        <w:spacing w:after="115"/>
+      </w:pPr>
+      <w:r>
+        <w:rPr>
+          <w:rFonts w:ascii="Calibri" w:cs="Calibri" w:eastAsia="Calibri" w:hAnsi="Calibri"/>
+          <w:sz w:val="21"/>
+          <w:szCs w:val="21"/>
+        </w:rPr>
+        <w:t xml:space="preserve">Para el SKU con mayor variación ajusté una regresión log-log de demanda semanal contra precio efectivo, con tendencia y estacionalidad. La elasticidad estimada está entre −2.98 y −2.58, según se controle o no por semanas con combo.</w:t>
+      </w:r>
+    </w:p>
+    <w:p>
+      <w:pPr>
+        <w:spacing w:after="115"/>
+      </w:pPr>
+      <w:r>
+        <w:rPr>
+          <w:rFonts w:ascii="Calibri" w:cs="Calibri" w:eastAsia="Calibri" w:hAnsi="Calibri"/>
+          <w:sz w:val="21"/>
+          <w:szCs w:val="21"/>
+        </w:rPr>
+        <w:t xml:space="preserve">Tomo ese rango con cautela. El precio cambia casi siempre cuando hay una promoción; la correlación entre precio y combo activo es −0.93. El coeficiente mezcla precio, visibilidad y mecánica promocional, así que no lo interpreto como un efecto causal puro. Dentro del rango observado, el simulador muestra que el precio que maximiza ingreso ($46.36) queda por debajo del costo unitario ($46.85). Mi recomendación es no perseguir ingreso a costa de margen.</w:t>
+      </w:r>
+    </w:p>
+    <w:p>
+      <w:pPr>
+        <w:pStyle w:val="Heading2"/>
+        <w:pageBreakBefore/>
+        <w:spacing w:after="65" w:before="170"/>
+      </w:pPr>
+      <w:r>
+        <w:t xml:space="preserve">Reto C | Uplift promocional</w:t>
+      </w:r>
+    </w:p>
+    <w:p>
+      <w:pPr>
+        <w:spacing w:after="115"/>
+      </w:pPr>
+      <w:r>
+        <w:rPr>
+          <w:rFonts w:ascii="Calibri" w:cs="Calibri" w:eastAsia="Calibri" w:hAnsi="Calibri"/>
+          <w:sz w:val="21"/>
+          <w:szCs w:val="21"/>
+        </w:rPr>
+        <w:t xml:space="preserve">Estimé el contrafactual de los 19 combos con un modelo estacional entrenado sólo en semanas sin promoción del mismo SKU. Después comparé las unidades observadas contra esa base. Para evaluar rentabilidad separé la ganancia de las unidades adicionales y el costo de aplicar el descuento a todas las unidades vendidas durante la promoción.</w:t>
+      </w:r>
+    </w:p>
+    <w:p>
+      <w:pPr>
+        <w:spacing w:after="115"/>
+      </w:pPr>
+      <w:r>
+        <w:rPr>
+          <w:rFonts w:ascii="Calibri" w:cs="Calibri" w:eastAsia="Calibri" w:hAnsi="Calibri"/>
+          <w:sz w:val="21"/>
+          <w:szCs w:val="21"/>
+        </w:rPr>
+        <w:t xml:space="preserve">Ninguna de las 19 promociones dejó margen incremental positivo. La mejor fue Combo Verano 2, con cobertura de 0.69: consiguió 69% del uplift necesario para pagarse. Dos promociones de Desodorante vendieron por debajo del costo, aunque mostraron los uplifts más altos. Verifiqué el margen con dos cálculos independientes y la diferencia fue menor a 1.5%.</w:t>
+      </w:r>
+    </w:p>
+    <w:p>
+      <w:pPr>
+        <w:pStyle w:val="Heading2"/>
+        <w:spacing w:after="65" w:before="170"/>
+      </w:pPr>
+      <w:r>
+        <w:t xml:space="preserve">Recomendaciones</w:t>
       </w:r>
     </w:p>
     <w:p>
@@ -787,15 +694,15 @@
           <w:ilvl w:val="0"/>
           <w:numId w:val="2"/>
         </w:numPr>
-        <w:spacing w:after="70"/>
-      </w:pPr>
-      <w:r>
-        <w:rPr>
-          <w:rFonts w:ascii="Calibri" w:cs="Calibri" w:eastAsia="Calibri" w:hAnsi="Calibri"/>
-          <w:sz w:val="19"/>
-          <w:szCs w:val="19"/>
-        </w:rPr>
-        <w:t xml:space="preserve">Fijar un tope de descuento por SKU y hacerlo regla dura. Cada producto tiene un descuento a partir del cual se vende bajo costo: 18.0% para Desodorante y Shampoo Verde, 19.4% para Cubito, 20.6% para Shampoo Azul, 21.3% para Shampoo Rizos, 23.1% para Antitranspirante. Dos combos de Desodorante ya cruzaron ese límite. Es la corrección más barata y de mayor impacto disponible.</w:t>
+        <w:spacing w:after="65"/>
+      </w:pPr>
+      <w:r>
+        <w:rPr>
+          <w:rFonts w:ascii="Calibri" w:cs="Calibri" w:eastAsia="Calibri" w:hAnsi="Calibri"/>
+          <w:sz w:val="21"/>
+          <w:szCs w:val="21"/>
+        </w:rPr>
+        <w:t xml:space="preserve">Definir un tope de descuento por SKU y usarlo como regla de aprobación. En este portafolio los límites van de 18.0% a 23.1%.</w:t>
       </w:r>
     </w:p>
     <w:p>
@@ -805,15 +712,15 @@
           <w:ilvl w:val="0"/>
           <w:numId w:val="2"/>
         </w:numPr>
-        <w:spacing w:after="70"/>
-      </w:pPr>
-      <w:r>
-        <w:rPr>
-          <w:rFonts w:ascii="Calibri" w:cs="Calibri" w:eastAsia="Calibri" w:hAnsi="Calibri"/>
-          <w:sz w:val="19"/>
-          <w:szCs w:val="19"/>
-        </w:rPr>
-        <w:t xml:space="preserve">Suspender “Combo Quincena Desodorante” y “Combo Cierre Trimestre Desodorante”. Vendieron bajo costo, así que ningún volumen las rescata. Son especialmente engañosas porque exhiben los uplifts más altos del catálogo (+86% y +128%): cuanto mejor funcionan, más cuestan.</w:t>
+        <w:spacing w:after="65"/>
+      </w:pPr>
+      <w:r>
+        <w:rPr>
+          <w:rFonts w:ascii="Calibri" w:cs="Calibri" w:eastAsia="Calibri" w:hAnsi="Calibri"/>
+          <w:sz w:val="21"/>
+          <w:szCs w:val="21"/>
+        </w:rPr>
+        <w:t xml:space="preserve">Suspender Combo Quincena Desodorante y Combo Cierre Trimestre Desodorante. Ambos cruzan el costo unitario.</w:t>
       </w:r>
     </w:p>
     <w:p>
@@ -823,15 +730,15 @@
           <w:ilvl w:val="0"/>
           <w:numId w:val="2"/>
         </w:numPr>
-        <w:spacing w:after="70"/>
-      </w:pPr>
-      <w:r>
-        <w:rPr>
-          <w:rFonts w:ascii="Calibri" w:cs="Calibri" w:eastAsia="Calibri" w:hAnsi="Calibri"/>
-          <w:sz w:val="19"/>
-          <w:szCs w:val="19"/>
-        </w:rPr>
-        <w:t xml:space="preserve">Volver a probar “Combo Verano 2” (Antitranspirante), pero más suave. Es la promoción con mejor desempeño del catálogo: generó +93% de unidades contra el +135% que necesitaba para pagarse (cobertura 0.69). Bajar la profundidad de 16.1% a ~11% reduce el costo del descuento un tercio y la deja cerca del equilibrio. Correrla como test controlado en un subconjunto de bodegas, no como rollout completo.</w:t>
+        <w:spacing w:after="65"/>
+      </w:pPr>
+      <w:r>
+        <w:rPr>
+          <w:rFonts w:ascii="Calibri" w:cs="Calibri" w:eastAsia="Calibri" w:hAnsi="Calibri"/>
+          <w:sz w:val="21"/>
+          <w:szCs w:val="21"/>
+        </w:rPr>
+        <w:t xml:space="preserve">Volver a probar Combo Verano 2 con menor descuento y sólo en algunas bodegas. Fue la promoción más cercana al equilibrio, pero todavía no fue rentable.</w:t>
       </w:r>
     </w:p>
     <w:p>
@@ -841,15 +748,15 @@
           <w:ilvl w:val="0"/>
           <w:numId w:val="2"/>
         </w:numPr>
-        <w:spacing w:after="70"/>
-      </w:pPr>
-      <w:r>
-        <w:rPr>
-          <w:rFonts w:ascii="Calibri" w:cs="Calibri" w:eastAsia="Calibri" w:hAnsi="Calibri"/>
-          <w:sz w:val="19"/>
-          <w:szCs w:val="19"/>
-        </w:rPr>
-        <w:t xml:space="preserve">Dejar de asumir que un descuento suave es una promoción segura. “Combo Temporada Fría” (Cubito) tuvo el descuento más bajo del catálogo (10%) y aun así perdió $61,816, porque su uplift fue de apenas +2.2%. Lo que decide la rentabilidad no es la profundidad sino la respuesta de demanda; en los SKUs de alimentos esa respuesta es consistentemente baja.</w:t>
+        <w:spacing w:after="65"/>
+      </w:pPr>
+      <w:r>
+        <w:rPr>
+          <w:rFonts w:ascii="Calibri" w:cs="Calibri" w:eastAsia="Calibri" w:hAnsi="Calibri"/>
+          <w:sz w:val="21"/>
+          <w:szCs w:val="21"/>
+        </w:rPr>
+        <w:t xml:space="preserve">No aprobar promociones sólo porque el descuento parece bajo. Combo Temporada Fría descontó 10% y perdió $61,816 por su baja respuesta de demanda.</w:t>
       </w:r>
     </w:p>
     <w:p>
@@ -859,114 +766,37 @@
           <w:ilvl w:val="0"/>
           <w:numId w:val="2"/>
         </w:numPr>
-        <w:spacing w:after="70"/>
-      </w:pPr>
-      <w:r>
-        <w:rPr>
-          <w:rFonts w:ascii="Calibri" w:cs="Calibri" w:eastAsia="Calibri" w:hAnsi="Calibri"/>
-          <w:sz w:val="19"/>
-          <w:szCs w:val="19"/>
-        </w:rPr>
-        <w:t xml:space="preserve">Usar el forecast con escenario promocional para el plan de reabasto. El modelo proyecta demanda con y sin promoción: para Desodorante, activar un combo al 15% lleva la demanda semanal de ~650 a ~1,360 unidades. Planear inventario con el escenario que corresponda al calendario aprobado, y recalibrar cada 4–6 semanas.</w:t>
+        <w:spacing w:after="65"/>
+      </w:pPr>
+      <w:r>
+        <w:rPr>
+          <w:rFonts w:ascii="Calibri" w:cs="Calibri" w:eastAsia="Calibri" w:hAnsi="Calibri"/>
+          <w:sz w:val="21"/>
+          <w:szCs w:val="21"/>
+        </w:rPr>
+        <w:t xml:space="preserve">Usar el escenario promocional del forecast para reabasto y recalibrarlo cada cuatro a seis semanas.</w:t>
       </w:r>
     </w:p>
     <w:p>
       <w:pPr>
         <w:pStyle w:val="Heading2"/>
-        <w:spacing w:after="70" w:before="190"/>
-      </w:pPr>
-      <w:r>
-        <w:t xml:space="preserve">5. Trade-offs y qué haría distinto con más tiempo o datos</w:t>
-      </w:r>
-    </w:p>
-    <w:p>
-      <w:pPr>
-        <w:pStyle w:val="ListParagraph"/>
-        <w:numPr>
-          <w:ilvl w:val="0"/>
-          <w:numId w:val="2"/>
-        </w:numPr>
-        <w:spacing w:after="70"/>
-      </w:pPr>
-      <w:r>
-        <w:rPr>
-          <w:rFonts w:ascii="Calibri" w:cs="Calibri" w:eastAsia="Calibri" w:hAnsi="Calibri"/>
-          <w:sz w:val="19"/>
-          <w:szCs w:val="19"/>
-        </w:rPr>
-        <w:t xml:space="preserve">Ninguna de las 19 promociones fue rentable en margen. Antes de concluir que el trade marketing destruye valor, habría que verificar con el cliente si el objetivo declarado es margen o si estas promociones compran distribución, espacio en anaquel o defensa competitiva — beneficios reales que este dataset no captura.</w:t>
-      </w:r>
-    </w:p>
-    <w:p>
-      <w:pPr>
-        <w:pStyle w:val="ListParagraph"/>
-        <w:numPr>
-          <w:ilvl w:val="0"/>
-          <w:numId w:val="2"/>
-        </w:numPr>
-        <w:spacing w:after="70"/>
-      </w:pPr>
-      <w:r>
-        <w:rPr>
-          <w:rFonts w:ascii="Calibri" w:cs="Calibri" w:eastAsia="Calibri" w:hAnsi="Calibri"/>
-          <w:sz w:val="19"/>
-          <w:szCs w:val="19"/>
-        </w:rPr>
-        <w:t xml:space="preserve">Reto C: el contrafactual estacional es razonable pero no es causal. Con más tiempo probaría control sintético o un diseño A/B geográfico (bodegas con y sin promoción), que separaría el efecto promocional de la estacionalidad general.</w:t>
-      </w:r>
-    </w:p>
-    <w:p>
-      <w:pPr>
-        <w:pStyle w:val="ListParagraph"/>
-        <w:numPr>
-          <w:ilvl w:val="0"/>
-          <w:numId w:val="2"/>
-        </w:numPr>
-        <w:spacing w:after="70"/>
-      </w:pPr>
-      <w:r>
-        <w:rPr>
-          <w:rFonts w:ascii="Calibri" w:cs="Calibri" w:eastAsia="Calibri" w:hAnsi="Calibri"/>
-          <w:sz w:val="19"/>
-          <w:szCs w:val="19"/>
-        </w:rPr>
-        <w:t xml:space="preserve">Reto B: la elasticidad no es identificable limpiamente porque el precio sólo se mueve con los combos. Un test de precio aleatorizado por bodega, aunque sea pequeño, valdría más que cualquier refinamiento del modelo actual.</w:t>
-      </w:r>
-    </w:p>
-    <w:p>
-      <w:pPr>
-        <w:pStyle w:val="ListParagraph"/>
-        <w:numPr>
-          <w:ilvl w:val="0"/>
-          <w:numId w:val="2"/>
-        </w:numPr>
-        <w:spacing w:after="70"/>
-      </w:pPr>
-      <w:r>
-        <w:rPr>
-          <w:rFonts w:ascii="Calibri" w:cs="Calibri" w:eastAsia="Calibri" w:hAnsi="Calibri"/>
-          <w:sz w:val="19"/>
-          <w:szCs w:val="19"/>
-        </w:rPr>
-        <w:t xml:space="preserve">Reto A: agregaría modelos jerárquicos que compartan información entre SKUs y bodegas, e intervalos de predicción — para reabasto importa tanto el nivel de servicio como el punto central.</w:t>
-      </w:r>
-    </w:p>
-    <w:p>
-      <w:pPr>
-        <w:pStyle w:val="ListParagraph"/>
-        <w:numPr>
-          <w:ilvl w:val="0"/>
-          <w:numId w:val="2"/>
-        </w:numPr>
-        <w:spacing w:after="70"/>
-      </w:pPr>
-      <w:r>
-        <w:rPr>
-          <w:rFonts w:ascii="Calibri" w:cs="Calibri" w:eastAsia="Calibri" w:hAnsi="Calibri"/>
-          <w:sz w:val="19"/>
-          <w:szCs w:val="19"/>
-        </w:rPr>
-        <w:t xml:space="preserve">En general, con un alcance de 4–6 horas se priorizó cobertura sólida de los tres retos y validación cruzada de los resultados por encima de afinar hiperparámetros o probar arquitecturas más complejas (SARIMA, Prophet, modelos causales de uplift).</w:t>
+        <w:spacing w:after="65" w:before="170"/>
+      </w:pPr>
+      <w:r>
+        <w:t xml:space="preserve">Limitaciones y siguiente paso</w:t>
+      </w:r>
+    </w:p>
+    <w:p>
+      <w:pPr>
+        <w:spacing w:after="115"/>
+      </w:pPr>
+      <w:r>
+        <w:rPr>
+          <w:rFonts w:ascii="Calibri" w:cs="Calibri" w:eastAsia="Calibri" w:hAnsi="Calibri"/>
+          <w:sz w:val="21"/>
+          <w:szCs w:val="21"/>
+        </w:rPr>
+        <w:t xml:space="preserve">El contrafactual promocional no es causal y la elasticidad está limitada por la poca variación de precio fuera de combos. Con más tiempo priorizaría una prueba por bodegas, con un grupo de control, antes que agregar complejidad al modelo. También incorporaría intervalos de predicción al forecast. Las versiones de Python y librerías usadas para generar estas cifras están fijadas en requirements.txt.</w:t>
       </w:r>
     </w:p>
     <w:sectPr>

</xml_diff>

<commit_message>
docs: unifica la voz de la entrega
</commit_message>
<xml_diff>
--- a/report/VEMIO_metodologia_hallazgos.docx
+++ b/report/VEMIO_metodologia_hallazgos.docx
@@ -639,7 +639,7 @@
           <w:sz w:val="21"/>
           <w:szCs w:val="21"/>
         </w:rPr>
-        <w:t xml:space="preserve">Tomo ese rango con cautela. El precio cambia casi siempre cuando hay una promoción; la correlación entre precio y combo activo es −0.93. El coeficiente mezcla precio, visibilidad y mecánica promocional, así que no lo interpreto como un efecto causal puro. Dentro del rango observado, el simulador muestra que el precio que maximiza ingreso ($46.36) queda por debajo del costo unitario ($46.85). Mi recomendación es no perseguir ingreso a costa de margen.</w:t>
+        <w:t xml:space="preserve">Tomo ese rango con cautela. El precio cambia casi siempre cuando hay una promoción; la correlación entre precio y combo activo es −0.93. El coeficiente mezcla precio, visibilidad y mecánica promocional, así que no lo interpreto como un efecto causal puro. Dentro del rango observado, el simulador muestra que el precio que maximiza ingreso ($46.36) queda por debajo del costo unitario ($46.85). Mi recomendación es no perseguir ingreso a costa de margen. Con más datos probaría precios por bodega para separar mejor cada efecto.</w:t>
       </w:r>
     </w:p>
     <w:p>
@@ -675,7 +675,7 @@
           <w:sz w:val="21"/>
           <w:szCs w:val="21"/>
         </w:rPr>
-        <w:t xml:space="preserve">Ninguna de las 19 promociones dejó margen incremental positivo. La mejor fue Combo Verano 2, con cobertura de 0.69: consiguió 69% del uplift necesario para pagarse. Dos promociones de Desodorante vendieron por debajo del costo, aunque mostraron los uplifts más altos. Verifiqué el margen con dos cálculos independientes y la diferencia fue menor a 1.5%.</w:t>
+        <w:t xml:space="preserve">Ninguna de las 19 promociones dejó margen incremental positivo. La mejor fue Combo Verano 2, con cobertura de 0.69: consiguió 69% del uplift necesario para pagarse. Dos promociones de Desodorante vendieron por debajo del costo, aunque mostraron los uplifts más altos. Verifiqué el margen con dos cálculos independientes y la diferencia fue menor a 1.5%. Si tuviera un grupo de bodegas sin promoción, lo usaría como control en lugar de depender sólo del modelo estacional.</w:t>
       </w:r>
     </w:p>
     <w:p>
@@ -775,28 +775,6 @@
           <w:szCs w:val="21"/>
         </w:rPr>
         <w:t xml:space="preserve">Usar el escenario promocional del forecast para reabasto y recalibrarlo cada cuatro a seis semanas.</w:t>
-      </w:r>
-    </w:p>
-    <w:p>
-      <w:pPr>
-        <w:pStyle w:val="Heading2"/>
-        <w:spacing w:after="65" w:before="170"/>
-      </w:pPr>
-      <w:r>
-        <w:t xml:space="preserve">Limitaciones y siguiente paso</w:t>
-      </w:r>
-    </w:p>
-    <w:p>
-      <w:pPr>
-        <w:spacing w:after="115"/>
-      </w:pPr>
-      <w:r>
-        <w:rPr>
-          <w:rFonts w:ascii="Calibri" w:cs="Calibri" w:eastAsia="Calibri" w:hAnsi="Calibri"/>
-          <w:sz w:val="21"/>
-          <w:szCs w:val="21"/>
-        </w:rPr>
-        <w:t xml:space="preserve">El contrafactual promocional no es causal y la elasticidad está limitada por la poca variación de precio fuera de combos. Con más tiempo priorizaría una prueba por bodegas, con un grupo de control, antes que agregar complejidad al modelo. También incorporaría intervalos de predicción al forecast. Las versiones de Python y librerías usadas para generar estas cifras están fijadas en requirements.txt.</w:t>
       </w:r>
     </w:p>
     <w:sectPr>

</xml_diff>